<commit_message>
Ocultar opciones de Leaderboard, Historial y boton de Iniciar Sesion en vista de login
</commit_message>
<xml_diff>
--- a/Crear el nuevo archivo en Google Drive para el proximo ciclo.docx
+++ b/Crear el nuevo archivo en Google Drive para el proximo ciclo.docx
@@ -52,14 +52,9 @@
     <w:p/>
     <w:p>
       <w:r>
-        <w:t xml:space="preserve">Paso A: </w:t>
-      </w:r>
-      <w:bookmarkStart w:id="0" w:name="_GoBack"/>
-      <w:r>
-        <w:t>Crear el nuevo archivo en Google Drive</w:t>
-      </w:r>
-    </w:p>
-    <w:bookmarkEnd w:id="0"/>
+        <w:t>Paso A: Crear el nuevo archivo en Google Drive</w:t>
+      </w:r>
+    </w:p>
     <w:p>
       <w:r>
         <w:t xml:space="preserve">En tu Google Drive, creas un nuevo documento de Google </w:t>
@@ -206,6 +201,1578 @@
         <w:lastRenderedPageBreak/>
         <w:t>Soporte Ilimitado de Años: Puedes configurar variables para 2028_2029, 2029_2030, etc., de la misma manera.</w:t>
       </w:r>
+    </w:p>
+    <w:p/>
+    <w:p>
+      <w:pPr>
+        <w:pBdr>
+          <w:top w:val="single" w:sz="2" w:space="0" w:color="auto"/>
+          <w:left w:val="single" w:sz="2" w:space="0" w:color="auto"/>
+          <w:bottom w:val="single" w:sz="2" w:space="0" w:color="auto"/>
+          <w:right w:val="single" w:sz="2" w:space="0" w:color="auto"/>
+        </w:pBdr>
+        <w:shd w:val="clear" w:color="auto" w:fill="F8F8F8"/>
+        <w:spacing w:after="0" w:line="240" w:lineRule="auto"/>
+        <w:rPr>
+          <w:rFonts w:ascii="Segoe UI" w:eastAsia="Times New Roman" w:hAnsi="Segoe UI" w:cs="Segoe UI"/>
+          <w:color w:val="3B3B3B"/>
+          <w:sz w:val="20"/>
+          <w:szCs w:val="20"/>
+          <w:lang w:eastAsia="es-US"/>
+        </w:rPr>
+      </w:pPr>
+      <w:r>
+        <w:rPr>
+          <w:rFonts w:ascii="Segoe UI" w:eastAsia="Times New Roman" w:hAnsi="Segoe UI" w:cs="Segoe UI"/>
+          <w:color w:val="3B3B3B"/>
+          <w:sz w:val="20"/>
+          <w:szCs w:val="20"/>
+          <w:lang w:eastAsia="es-US"/>
+        </w:rPr>
+        <w:t>documento en Excel con todos los pasos detallados para el inicio de cada ciclo escolar y lo he integrado directamente a tu aplicación.</w:t>
+      </w:r>
+    </w:p>
+    <w:p>
+      <w:pPr>
+        <w:pBdr>
+          <w:top w:val="single" w:sz="2" w:space="0" w:color="auto"/>
+          <w:left w:val="single" w:sz="2" w:space="0" w:color="auto"/>
+          <w:bottom w:val="single" w:sz="2" w:space="0" w:color="auto"/>
+          <w:right w:val="single" w:sz="2" w:space="0" w:color="auto"/>
+        </w:pBdr>
+        <w:shd w:val="clear" w:color="auto" w:fill="F8F8F8"/>
+        <w:spacing w:before="100" w:beforeAutospacing="1" w:after="100" w:afterAutospacing="1" w:line="240" w:lineRule="auto"/>
+        <w:outlineLvl w:val="2"/>
+        <w:rPr>
+          <w:rFonts w:ascii="Segoe UI" w:eastAsia="Times New Roman" w:hAnsi="Segoe UI" w:cs="Segoe UI"/>
+          <w:color w:val="3B3B3B"/>
+          <w:sz w:val="27"/>
+          <w:szCs w:val="27"/>
+          <w:lang w:eastAsia="es-US"/>
+        </w:rPr>
+      </w:pPr>
+      <w:r>
+        <w:rPr>
+          <w:rFonts w:ascii="Segoe UI Emoji" w:eastAsia="Times New Roman" w:hAnsi="Segoe UI Emoji" w:cs="Segoe UI Emoji"/>
+          <w:color w:val="3B3B3B"/>
+          <w:sz w:val="27"/>
+          <w:szCs w:val="27"/>
+          <w:lang w:eastAsia="es-US"/>
+        </w:rPr>
+        <w:t>📥</w:t>
+      </w:r>
+      <w:r>
+        <w:rPr>
+          <w:rFonts w:ascii="Segoe UI" w:eastAsia="Times New Roman" w:hAnsi="Segoe UI" w:cs="Segoe UI"/>
+          <w:color w:val="3B3B3B"/>
+          <w:sz w:val="27"/>
+          <w:szCs w:val="27"/>
+          <w:lang w:eastAsia="es-US"/>
+        </w:rPr>
+        <w:t xml:space="preserve"> ¿Cómo descargar tu documento en Excel?</w:t>
+      </w:r>
+    </w:p>
+    <w:p>
+      <w:pPr>
+        <w:numPr>
+          <w:ilvl w:val="0"/>
+          <w:numId w:val="6"/>
+        </w:numPr>
+        <w:pBdr>
+          <w:top w:val="single" w:sz="2" w:space="0" w:color="auto"/>
+          <w:left w:val="single" w:sz="2" w:space="0" w:color="auto"/>
+          <w:bottom w:val="single" w:sz="2" w:space="0" w:color="auto"/>
+          <w:right w:val="single" w:sz="2" w:space="0" w:color="auto"/>
+        </w:pBdr>
+        <w:shd w:val="clear" w:color="auto" w:fill="F8F8F8"/>
+        <w:spacing w:before="100" w:beforeAutospacing="1" w:after="100" w:afterAutospacing="1" w:line="240" w:lineRule="auto"/>
+        <w:rPr>
+          <w:rFonts w:ascii="Segoe UI" w:eastAsia="Times New Roman" w:hAnsi="Segoe UI" w:cs="Segoe UI"/>
+          <w:color w:val="3B3B3B"/>
+          <w:sz w:val="20"/>
+          <w:szCs w:val="20"/>
+          <w:lang w:eastAsia="es-US"/>
+        </w:rPr>
+      </w:pPr>
+      <w:r>
+        <w:rPr>
+          <w:rFonts w:ascii="Segoe UI" w:eastAsia="Times New Roman" w:hAnsi="Segoe UI" w:cs="Segoe UI"/>
+          <w:color w:val="3B3B3B"/>
+          <w:sz w:val="20"/>
+          <w:szCs w:val="20"/>
+          <w:lang w:eastAsia="es-US"/>
+        </w:rPr>
+        <w:t>Puedes descargarlo directamente en tu aplicación haciendo clic en el nuevo botón verde </w:t>
+      </w:r>
+      <w:r>
+        <w:rPr>
+          <w:rFonts w:ascii="Segoe UI Emoji" w:eastAsia="Times New Roman" w:hAnsi="Segoe UI Emoji" w:cs="Segoe UI Emoji"/>
+          <w:b/>
+          <w:bCs/>
+          <w:color w:val="3B3B3B"/>
+          <w:sz w:val="18"/>
+          <w:szCs w:val="18"/>
+          <w:bdr w:val="single" w:sz="2" w:space="0" w:color="auto" w:frame="1"/>
+          <w:lang w:eastAsia="es-US"/>
+        </w:rPr>
+        <w:t>📊</w:t>
+      </w:r>
+      <w:r>
+        <w:rPr>
+          <w:rFonts w:ascii="Consolas" w:eastAsia="Times New Roman" w:hAnsi="Consolas" w:cs="Courier New"/>
+          <w:b/>
+          <w:bCs/>
+          <w:color w:val="3B3B3B"/>
+          <w:sz w:val="18"/>
+          <w:szCs w:val="18"/>
+          <w:bdr w:val="single" w:sz="2" w:space="0" w:color="auto" w:frame="1"/>
+          <w:lang w:eastAsia="es-US"/>
+        </w:rPr>
+        <w:t xml:space="preserve"> Guía Excel Ciclos</w:t>
+      </w:r>
+      <w:r>
+        <w:rPr>
+          <w:rFonts w:ascii="Segoe UI" w:eastAsia="Times New Roman" w:hAnsi="Segoe UI" w:cs="Segoe UI"/>
+          <w:color w:val="3B3B3B"/>
+          <w:sz w:val="20"/>
+          <w:szCs w:val="20"/>
+          <w:lang w:eastAsia="es-US"/>
+        </w:rPr>
+        <w:t> que agregué en el menú </w:t>
+      </w:r>
+      <w:r>
+        <w:rPr>
+          <w:rFonts w:ascii="Segoe UI" w:eastAsia="Times New Roman" w:hAnsi="Segoe UI" w:cs="Segoe UI"/>
+          <w:b/>
+          <w:bCs/>
+          <w:color w:val="3B3B3B"/>
+          <w:sz w:val="20"/>
+          <w:szCs w:val="20"/>
+          <w:bdr w:val="single" w:sz="2" w:space="0" w:color="auto" w:frame="1"/>
+          <w:lang w:eastAsia="es-US"/>
+        </w:rPr>
+        <w:t>Tabla Mejores Resultados</w:t>
+      </w:r>
+      <w:r>
+        <w:rPr>
+          <w:rFonts w:ascii="Segoe UI" w:eastAsia="Times New Roman" w:hAnsi="Segoe UI" w:cs="Segoe UI"/>
+          <w:color w:val="3B3B3B"/>
+          <w:sz w:val="20"/>
+          <w:szCs w:val="20"/>
+          <w:lang w:eastAsia="es-US"/>
+        </w:rPr>
+        <w:t> (junto al botón de Exportar PDF).</w:t>
+      </w:r>
+    </w:p>
+    <w:p>
+      <w:pPr>
+        <w:numPr>
+          <w:ilvl w:val="0"/>
+          <w:numId w:val="6"/>
+        </w:numPr>
+        <w:pBdr>
+          <w:top w:val="single" w:sz="2" w:space="0" w:color="auto"/>
+          <w:left w:val="single" w:sz="2" w:space="0" w:color="auto"/>
+          <w:bottom w:val="single" w:sz="2" w:space="0" w:color="auto"/>
+          <w:right w:val="single" w:sz="2" w:space="0" w:color="auto"/>
+        </w:pBdr>
+        <w:shd w:val="clear" w:color="auto" w:fill="F8F8F8"/>
+        <w:spacing w:before="100" w:beforeAutospacing="1" w:after="100" w:afterAutospacing="1" w:line="240" w:lineRule="auto"/>
+        <w:rPr>
+          <w:rFonts w:ascii="Times New Roman" w:eastAsia="Times New Roman" w:hAnsi="Times New Roman" w:cs="Times New Roman"/>
+          <w:b/>
+          <w:bCs/>
+          <w:sz w:val="24"/>
+          <w:szCs w:val="24"/>
+          <w:bdr w:val="single" w:sz="2" w:space="0" w:color="auto" w:frame="1"/>
+          <w:lang w:eastAsia="es-US"/>
+        </w:rPr>
+      </w:pPr>
+      <w:r>
+        <w:rPr>
+          <w:rFonts w:ascii="Segoe UI" w:eastAsia="Times New Roman" w:hAnsi="Segoe UI" w:cs="Segoe UI"/>
+          <w:color w:val="3B3B3B"/>
+          <w:sz w:val="20"/>
+          <w:szCs w:val="20"/>
+          <w:lang w:eastAsia="es-US"/>
+        </w:rPr>
+        <w:t xml:space="preserve">O puedes descargarlo directamente con este enlace si ya tienes tu app abierta: </w:t>
+      </w:r>
+      <w:r>
+        <w:rPr>
+          <w:rFonts w:ascii="Segoe UI Emoji" w:eastAsia="Times New Roman" w:hAnsi="Segoe UI Emoji" w:cs="Segoe UI Emoji"/>
+          <w:color w:val="3B3B3B"/>
+          <w:sz w:val="20"/>
+          <w:szCs w:val="20"/>
+          <w:lang w:eastAsia="es-US"/>
+        </w:rPr>
+        <w:t>👉</w:t>
+      </w:r>
+      <w:r>
+        <w:rPr>
+          <w:rFonts w:ascii="Segoe UI" w:eastAsia="Times New Roman" w:hAnsi="Segoe UI" w:cs="Segoe UI"/>
+          <w:color w:val="3B3B3B"/>
+          <w:sz w:val="20"/>
+          <w:szCs w:val="20"/>
+          <w:lang w:eastAsia="es-US"/>
+        </w:rPr>
+        <w:t> </w:t>
+      </w:r>
+    </w:p>
+    <w:p>
+      <w:pPr>
+        <w:pBdr>
+          <w:top w:val="single" w:sz="2" w:space="0" w:color="auto"/>
+          <w:left w:val="single" w:sz="2" w:space="0" w:color="auto"/>
+          <w:bottom w:val="single" w:sz="2" w:space="0" w:color="auto"/>
+          <w:right w:val="single" w:sz="2" w:space="0" w:color="auto"/>
+        </w:pBdr>
+        <w:shd w:val="clear" w:color="auto" w:fill="F8F8F8"/>
+        <w:spacing w:before="100" w:beforeAutospacing="1" w:after="100" w:afterAutospacing="1" w:line="240" w:lineRule="auto"/>
+        <w:ind w:left="720"/>
+        <w:rPr>
+          <w:rFonts w:ascii="Times New Roman" w:eastAsia="Times New Roman" w:hAnsi="Times New Roman" w:cs="Times New Roman"/>
+          <w:sz w:val="24"/>
+          <w:szCs w:val="24"/>
+          <w:lang w:eastAsia="es-US"/>
+        </w:rPr>
+      </w:pPr>
+      <w:r>
+        <w:rPr>
+          <w:rFonts w:ascii="Segoe UI" w:eastAsia="Times New Roman" w:hAnsi="Segoe UI" w:cs="Segoe UI"/>
+          <w:b/>
+          <w:bCs/>
+          <w:noProof/>
+          <w:color w:val="3B3B3B"/>
+          <w:sz w:val="20"/>
+          <w:szCs w:val="20"/>
+          <w:bdr w:val="single" w:sz="2" w:space="0" w:color="auto" w:frame="1"/>
+          <w:lang w:eastAsia="es-US"/>
+        </w:rPr>
+        <mc:AlternateContent>
+          <mc:Choice Requires="wps">
+            <w:drawing>
+              <wp:inline distT="0" distB="0" distL="0" distR="0">
+                <wp:extent cx="308610" cy="308610"/>
+                <wp:effectExtent l="0" t="0" r="0" b="0"/>
+                <wp:docPr id="1" name="Rectángulo 1" descr="vscode-file://vscode-app/c:/Users/Memo%20Segovia/AppData/Local/Programs/Antigravity%20IDE/resources/app/extensions/theme-symbols/src/icons/files/csv.svg"/>
+                <wp:cNvGraphicFramePr>
+                  <a:graphicFrameLocks xmlns:a="http://schemas.openxmlformats.org/drawingml/2006/main" noChangeAspect="1"/>
+                </wp:cNvGraphicFramePr>
+                <a:graphic xmlns:a="http://schemas.openxmlformats.org/drawingml/2006/main">
+                  <a:graphicData uri="http://schemas.microsoft.com/office/word/2010/wordprocessingShape">
+                    <wps:wsp>
+                      <wps:cNvSpPr>
+                        <a:spLocks noChangeAspect="1" noChangeArrowheads="1"/>
+                      </wps:cNvSpPr>
+                      <wps:spPr bwMode="auto">
+                        <a:xfrm>
+                          <a:off x="0" y="0"/>
+                          <a:ext cx="308610" cy="308610"/>
+                        </a:xfrm>
+                        <a:prstGeom prst="rect">
+                          <a:avLst/>
+                        </a:prstGeom>
+                        <a:noFill/>
+                        <a:ln>
+                          <a:noFill/>
+                        </a:ln>
+                        <a:extLst>
+                          <a:ext uri="{909E8E84-426E-40DD-AFC4-6F175D3DCCD1}">
+                            <a14:hiddenFill xmlns:a14="http://schemas.microsoft.com/office/drawing/2010/main">
+                              <a:solidFill>
+                                <a:srgbClr val="FFFFFF"/>
+                              </a:solidFill>
+                            </a14:hiddenFill>
+                          </a:ext>
+                          <a:ext uri="{91240B29-F687-4F45-9708-019B960494DF}">
+                            <a14:hiddenLine xmlns:a14="http://schemas.microsoft.com/office/drawing/2010/main" w="9525">
+                              <a:solidFill>
+                                <a:srgbClr val="000000"/>
+                              </a:solidFill>
+                              <a:miter lim="800000"/>
+                              <a:headEnd/>
+                              <a:tailEnd/>
+                            </a14:hiddenLine>
+                          </a:ext>
+                        </a:extLst>
+                      </wps:spPr>
+                      <wps:bodyPr rot="0" vert="horz" wrap="square" lIns="91440" tIns="45720" rIns="91440" bIns="45720" anchor="t" anchorCtr="0" upright="1">
+                        <a:noAutofit/>
+                      </wps:bodyPr>
+                    </wps:wsp>
+                  </a:graphicData>
+                </a:graphic>
+              </wp:inline>
+            </w:drawing>
+          </mc:Choice>
+          <mc:Fallback>
+            <w:pict>
+              <v:rect w14:anchorId="284B793F" id="Rectángulo 1" o:spid="_x0000_s1026" alt="vscode-file://vscode-app/c:/Users/Memo%20Segovia/AppData/Local/Programs/Antigravity%20IDE/resources/app/extensions/theme-symbols/src/icons/files/csv.svg" style="width:24.3pt;height:24.3pt;visibility:visible;mso-wrap-style:square;mso-left-percent:-10001;mso-top-percent:-10001;mso-position-horizontal:absolute;mso-position-horizontal-relative:char;mso-position-vertical:absolute;mso-position-vertical-relative:line;mso-left-percent:-10001;mso-top-percent:-10001;v-text-anchor:top" o:gfxdata="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" filled="f" stroked="f">
+                <o:lock v:ext="edit" aspectratio="t"/>
+                <w10:anchorlock/>
+              </v:rect>
+            </w:pict>
+          </mc:Fallback>
+        </mc:AlternateContent>
+      </w:r>
+    </w:p>
+    <w:p>
+      <w:pPr>
+        <w:pBdr>
+          <w:top w:val="single" w:sz="2" w:space="0" w:color="auto"/>
+          <w:left w:val="single" w:sz="2" w:space="0" w:color="auto"/>
+          <w:bottom w:val="single" w:sz="2" w:space="0" w:color="auto"/>
+          <w:right w:val="single" w:sz="2" w:space="0" w:color="auto"/>
+        </w:pBdr>
+        <w:shd w:val="clear" w:color="auto" w:fill="F8F8F8"/>
+        <w:spacing w:before="100" w:beforeAutospacing="1" w:after="100" w:afterAutospacing="1" w:line="240" w:lineRule="auto"/>
+        <w:ind w:left="720"/>
+        <w:rPr>
+          <w:rFonts w:ascii="Segoe UI" w:eastAsia="Times New Roman" w:hAnsi="Segoe UI" w:cs="Segoe UI"/>
+          <w:color w:val="3B3B3B"/>
+          <w:sz w:val="20"/>
+          <w:szCs w:val="20"/>
+          <w:lang w:eastAsia="es-US"/>
+        </w:rPr>
+      </w:pPr>
+      <w:r>
+        <w:rPr>
+          <w:rFonts w:ascii="Segoe UI" w:eastAsia="Times New Roman" w:hAnsi="Segoe UI" w:cs="Segoe UI"/>
+          <w:b/>
+          <w:bCs/>
+          <w:color w:val="3B3B3B"/>
+          <w:sz w:val="20"/>
+          <w:szCs w:val="20"/>
+          <w:bdr w:val="single" w:sz="2" w:space="0" w:color="auto" w:frame="1"/>
+          <w:lang w:eastAsia="es-US"/>
+        </w:rPr>
+        <w:t>Pasos_Inicio_Ciclo_Escolar_TrackCM.xlsx</w:t>
+      </w:r>
+    </w:p>
+    <w:p>
+      <w:pPr>
+        <w:spacing w:after="0" w:line="240" w:lineRule="auto"/>
+        <w:rPr>
+          <w:rFonts w:ascii="Times New Roman" w:eastAsia="Times New Roman" w:hAnsi="Times New Roman" w:cs="Times New Roman"/>
+          <w:sz w:val="24"/>
+          <w:szCs w:val="24"/>
+          <w:lang w:eastAsia="es-US"/>
+        </w:rPr>
+      </w:pPr>
+      <w:r>
+        <w:rPr>
+          <w:rFonts w:ascii="Times New Roman" w:eastAsia="Times New Roman" w:hAnsi="Times New Roman" w:cs="Times New Roman"/>
+          <w:sz w:val="24"/>
+          <w:szCs w:val="24"/>
+          <w:lang w:eastAsia="es-US"/>
+        </w:rPr>
+        <w:pict>
+          <v:rect id="_x0000_i1026" style="width:288.75pt;height:.75pt" o:hrpct="0" o:hralign="center" o:hrstd="t" o:hr="t" fillcolor="#a0a0a0" stroked="f"/>
+        </w:pict>
+      </w:r>
+    </w:p>
+    <w:p>
+      <w:pPr>
+        <w:pBdr>
+          <w:top w:val="single" w:sz="2" w:space="0" w:color="auto"/>
+          <w:left w:val="single" w:sz="2" w:space="0" w:color="auto"/>
+          <w:bottom w:val="single" w:sz="2" w:space="0" w:color="auto"/>
+          <w:right w:val="single" w:sz="2" w:space="0" w:color="auto"/>
+        </w:pBdr>
+        <w:shd w:val="clear" w:color="auto" w:fill="F8F8F8"/>
+        <w:spacing w:before="100" w:beforeAutospacing="1" w:after="100" w:afterAutospacing="1" w:line="240" w:lineRule="auto"/>
+        <w:outlineLvl w:val="2"/>
+        <w:rPr>
+          <w:rFonts w:ascii="Segoe UI" w:eastAsia="Times New Roman" w:hAnsi="Segoe UI" w:cs="Segoe UI"/>
+          <w:color w:val="3B3B3B"/>
+          <w:sz w:val="27"/>
+          <w:szCs w:val="27"/>
+          <w:lang w:eastAsia="es-US"/>
+        </w:rPr>
+      </w:pPr>
+      <w:r>
+        <w:rPr>
+          <w:rFonts w:ascii="Segoe UI Emoji" w:eastAsia="Times New Roman" w:hAnsi="Segoe UI Emoji" w:cs="Segoe UI Emoji"/>
+          <w:color w:val="3B3B3B"/>
+          <w:sz w:val="27"/>
+          <w:szCs w:val="27"/>
+          <w:lang w:eastAsia="es-US"/>
+        </w:rPr>
+        <w:t>📋</w:t>
+      </w:r>
+      <w:r>
+        <w:rPr>
+          <w:rFonts w:ascii="Segoe UI" w:eastAsia="Times New Roman" w:hAnsi="Segoe UI" w:cs="Segoe UI"/>
+          <w:color w:val="3B3B3B"/>
+          <w:sz w:val="27"/>
+          <w:szCs w:val="27"/>
+          <w:lang w:eastAsia="es-US"/>
+        </w:rPr>
+        <w:t xml:space="preserve"> Resumen del contenido de tu archivo Excel:</w:t>
+      </w:r>
+    </w:p>
+    <w:p>
+      <w:pPr>
+        <w:pBdr>
+          <w:top w:val="single" w:sz="2" w:space="0" w:color="auto"/>
+          <w:left w:val="single" w:sz="2" w:space="0" w:color="auto"/>
+          <w:bottom w:val="single" w:sz="2" w:space="0" w:color="auto"/>
+          <w:right w:val="single" w:sz="2" w:space="0" w:color="auto"/>
+        </w:pBdr>
+        <w:shd w:val="clear" w:color="auto" w:fill="F8F8F8"/>
+        <w:spacing w:after="0" w:line="240" w:lineRule="auto"/>
+        <w:rPr>
+          <w:rFonts w:ascii="Segoe UI" w:eastAsia="Times New Roman" w:hAnsi="Segoe UI" w:cs="Segoe UI"/>
+          <w:color w:val="3B3B3B"/>
+          <w:sz w:val="20"/>
+          <w:szCs w:val="20"/>
+          <w:lang w:eastAsia="es-US"/>
+        </w:rPr>
+      </w:pPr>
+      <w:r>
+        <w:rPr>
+          <w:rFonts w:ascii="Segoe UI" w:eastAsia="Times New Roman" w:hAnsi="Segoe UI" w:cs="Segoe UI"/>
+          <w:color w:val="3B3B3B"/>
+          <w:sz w:val="20"/>
+          <w:szCs w:val="20"/>
+          <w:lang w:eastAsia="es-US"/>
+        </w:rPr>
+        <w:t>Tu archivo Excel contiene </w:t>
+      </w:r>
+      <w:r>
+        <w:rPr>
+          <w:rFonts w:ascii="Segoe UI" w:eastAsia="Times New Roman" w:hAnsi="Segoe UI" w:cs="Segoe UI"/>
+          <w:b/>
+          <w:bCs/>
+          <w:color w:val="3B3B3B"/>
+          <w:sz w:val="20"/>
+          <w:szCs w:val="20"/>
+          <w:bdr w:val="single" w:sz="2" w:space="0" w:color="auto" w:frame="1"/>
+          <w:lang w:eastAsia="es-US"/>
+        </w:rPr>
+        <w:t>2 pestañas organizadas</w:t>
+      </w:r>
+      <w:r>
+        <w:rPr>
+          <w:rFonts w:ascii="Segoe UI" w:eastAsia="Times New Roman" w:hAnsi="Segoe UI" w:cs="Segoe UI"/>
+          <w:color w:val="3B3B3B"/>
+          <w:sz w:val="20"/>
+          <w:szCs w:val="20"/>
+          <w:lang w:eastAsia="es-US"/>
+        </w:rPr>
+        <w:t>:</w:t>
+      </w:r>
+    </w:p>
+    <w:p>
+      <w:pPr>
+        <w:pBdr>
+          <w:top w:val="single" w:sz="2" w:space="0" w:color="auto"/>
+          <w:left w:val="single" w:sz="2" w:space="0" w:color="auto"/>
+          <w:bottom w:val="single" w:sz="2" w:space="0" w:color="auto"/>
+          <w:right w:val="single" w:sz="2" w:space="0" w:color="auto"/>
+        </w:pBdr>
+        <w:shd w:val="clear" w:color="auto" w:fill="F8F8F8"/>
+        <w:spacing w:before="100" w:beforeAutospacing="1" w:after="100" w:afterAutospacing="1" w:line="240" w:lineRule="auto"/>
+        <w:outlineLvl w:val="3"/>
+        <w:rPr>
+          <w:rFonts w:ascii="Segoe UI" w:eastAsia="Times New Roman" w:hAnsi="Segoe UI" w:cs="Segoe UI"/>
+          <w:color w:val="3B3B3B"/>
+          <w:sz w:val="20"/>
+          <w:szCs w:val="20"/>
+          <w:lang w:eastAsia="es-US"/>
+        </w:rPr>
+      </w:pPr>
+      <w:r>
+        <w:rPr>
+          <w:rFonts w:ascii="Segoe UI" w:eastAsia="Times New Roman" w:hAnsi="Segoe UI" w:cs="Segoe UI"/>
+          <w:color w:val="3B3B3B"/>
+          <w:sz w:val="20"/>
+          <w:szCs w:val="20"/>
+          <w:lang w:eastAsia="es-US"/>
+        </w:rPr>
+        <w:t>1. Pestaña </w:t>
+      </w:r>
+      <w:r>
+        <w:rPr>
+          <w:rFonts w:ascii="Consolas" w:eastAsia="Times New Roman" w:hAnsi="Consolas" w:cs="Courier New"/>
+          <w:b/>
+          <w:bCs/>
+          <w:color w:val="3B3B3B"/>
+          <w:sz w:val="18"/>
+          <w:szCs w:val="18"/>
+          <w:bdr w:val="single" w:sz="2" w:space="0" w:color="auto" w:frame="1"/>
+          <w:lang w:eastAsia="es-US"/>
+        </w:rPr>
+        <w:t>Pasos Nuevo Ciclo</w:t>
+      </w:r>
+      <w:r>
+        <w:rPr>
+          <w:rFonts w:ascii="Segoe UI" w:eastAsia="Times New Roman" w:hAnsi="Segoe UI" w:cs="Segoe UI"/>
+          <w:color w:val="3B3B3B"/>
+          <w:sz w:val="20"/>
+          <w:szCs w:val="20"/>
+          <w:lang w:eastAsia="es-US"/>
+        </w:rPr>
+        <w:t> (</w:t>
+      </w:r>
+      <w:proofErr w:type="spellStart"/>
+      <w:r>
+        <w:rPr>
+          <w:rFonts w:ascii="Segoe UI" w:eastAsia="Times New Roman" w:hAnsi="Segoe UI" w:cs="Segoe UI"/>
+          <w:color w:val="3B3B3B"/>
+          <w:sz w:val="20"/>
+          <w:szCs w:val="20"/>
+          <w:lang w:eastAsia="es-US"/>
+        </w:rPr>
+        <w:t>Checklist</w:t>
+      </w:r>
+      <w:proofErr w:type="spellEnd"/>
+      <w:r>
+        <w:rPr>
+          <w:rFonts w:ascii="Segoe UI" w:eastAsia="Times New Roman" w:hAnsi="Segoe UI" w:cs="Segoe UI"/>
+          <w:color w:val="3B3B3B"/>
+          <w:sz w:val="20"/>
+          <w:szCs w:val="20"/>
+          <w:lang w:eastAsia="es-US"/>
+        </w:rPr>
+        <w:t xml:space="preserve"> de Trabajo):</w:t>
+      </w:r>
+    </w:p>
+    <w:p>
+      <w:pPr>
+        <w:numPr>
+          <w:ilvl w:val="0"/>
+          <w:numId w:val="7"/>
+        </w:numPr>
+        <w:pBdr>
+          <w:top w:val="single" w:sz="2" w:space="0" w:color="auto"/>
+          <w:left w:val="single" w:sz="2" w:space="0" w:color="auto"/>
+          <w:bottom w:val="single" w:sz="2" w:space="0" w:color="auto"/>
+          <w:right w:val="single" w:sz="2" w:space="0" w:color="auto"/>
+        </w:pBdr>
+        <w:shd w:val="clear" w:color="auto" w:fill="F8F8F8"/>
+        <w:spacing w:before="100" w:beforeAutospacing="1" w:after="100" w:afterAutospacing="1" w:line="240" w:lineRule="auto"/>
+        <w:rPr>
+          <w:rFonts w:ascii="Segoe UI" w:eastAsia="Times New Roman" w:hAnsi="Segoe UI" w:cs="Segoe UI"/>
+          <w:color w:val="3B3B3B"/>
+          <w:sz w:val="20"/>
+          <w:szCs w:val="20"/>
+          <w:lang w:eastAsia="es-US"/>
+        </w:rPr>
+      </w:pPr>
+      <w:r>
+        <w:rPr>
+          <w:rFonts w:ascii="Segoe UI" w:eastAsia="Times New Roman" w:hAnsi="Segoe UI" w:cs="Segoe UI"/>
+          <w:b/>
+          <w:bCs/>
+          <w:color w:val="3B3B3B"/>
+          <w:sz w:val="20"/>
+          <w:szCs w:val="20"/>
+          <w:bdr w:val="single" w:sz="2" w:space="0" w:color="auto" w:frame="1"/>
+          <w:lang w:eastAsia="es-US"/>
+        </w:rPr>
+        <w:t>Paso 1 (Google Drive)</w:t>
+      </w:r>
+      <w:r>
+        <w:rPr>
+          <w:rFonts w:ascii="Segoe UI" w:eastAsia="Times New Roman" w:hAnsi="Segoe UI" w:cs="Segoe UI"/>
+          <w:color w:val="3B3B3B"/>
+          <w:sz w:val="20"/>
+          <w:szCs w:val="20"/>
+          <w:lang w:eastAsia="es-US"/>
+        </w:rPr>
+        <w:t>: Crear nueva Hoja de Cálculo en Google Drive con el nombre del ciclo escolar (ej. </w:t>
+      </w:r>
+      <w:proofErr w:type="spellStart"/>
+      <w:r>
+        <w:rPr>
+          <w:rFonts w:ascii="Consolas" w:eastAsia="Times New Roman" w:hAnsi="Consolas" w:cs="Courier New"/>
+          <w:color w:val="3B3B3B"/>
+          <w:sz w:val="18"/>
+          <w:szCs w:val="18"/>
+          <w:bdr w:val="single" w:sz="2" w:space="0" w:color="auto" w:frame="1"/>
+          <w:lang w:eastAsia="es-US"/>
+        </w:rPr>
+        <w:t>TrackCM</w:t>
+      </w:r>
+      <w:proofErr w:type="spellEnd"/>
+      <w:r>
+        <w:rPr>
+          <w:rFonts w:ascii="Consolas" w:eastAsia="Times New Roman" w:hAnsi="Consolas" w:cs="Courier New"/>
+          <w:color w:val="3B3B3B"/>
+          <w:sz w:val="18"/>
+          <w:szCs w:val="18"/>
+          <w:bdr w:val="single" w:sz="2" w:space="0" w:color="auto" w:frame="1"/>
+          <w:lang w:eastAsia="es-US"/>
+        </w:rPr>
+        <w:t xml:space="preserve"> - Mejores Resultados 2027-2028</w:t>
+      </w:r>
+      <w:r>
+        <w:rPr>
+          <w:rFonts w:ascii="Segoe UI" w:eastAsia="Times New Roman" w:hAnsi="Segoe UI" w:cs="Segoe UI"/>
+          <w:color w:val="3B3B3B"/>
+          <w:sz w:val="20"/>
+          <w:szCs w:val="20"/>
+          <w:lang w:eastAsia="es-US"/>
+        </w:rPr>
+        <w:t>).</w:t>
+      </w:r>
+    </w:p>
+    <w:p>
+      <w:pPr>
+        <w:numPr>
+          <w:ilvl w:val="0"/>
+          <w:numId w:val="7"/>
+        </w:numPr>
+        <w:pBdr>
+          <w:top w:val="single" w:sz="2" w:space="0" w:color="auto"/>
+          <w:left w:val="single" w:sz="2" w:space="0" w:color="auto"/>
+          <w:bottom w:val="single" w:sz="2" w:space="0" w:color="auto"/>
+          <w:right w:val="single" w:sz="2" w:space="0" w:color="auto"/>
+        </w:pBdr>
+        <w:shd w:val="clear" w:color="auto" w:fill="F8F8F8"/>
+        <w:spacing w:before="100" w:beforeAutospacing="1" w:after="100" w:afterAutospacing="1" w:line="240" w:lineRule="auto"/>
+        <w:rPr>
+          <w:rFonts w:ascii="Segoe UI" w:eastAsia="Times New Roman" w:hAnsi="Segoe UI" w:cs="Segoe UI"/>
+          <w:color w:val="3B3B3B"/>
+          <w:sz w:val="20"/>
+          <w:szCs w:val="20"/>
+          <w:lang w:eastAsia="es-US"/>
+        </w:rPr>
+      </w:pPr>
+      <w:r>
+        <w:rPr>
+          <w:rFonts w:ascii="Segoe UI" w:eastAsia="Times New Roman" w:hAnsi="Segoe UI" w:cs="Segoe UI"/>
+          <w:b/>
+          <w:bCs/>
+          <w:color w:val="3B3B3B"/>
+          <w:sz w:val="20"/>
+          <w:szCs w:val="20"/>
+          <w:bdr w:val="single" w:sz="2" w:space="0" w:color="auto" w:frame="1"/>
+          <w:lang w:eastAsia="es-US"/>
+        </w:rPr>
+        <w:t>Paso 2 (Google Drive)</w:t>
+      </w:r>
+      <w:r>
+        <w:rPr>
+          <w:rFonts w:ascii="Segoe UI" w:eastAsia="Times New Roman" w:hAnsi="Segoe UI" w:cs="Segoe UI"/>
+          <w:color w:val="3B3B3B"/>
+          <w:sz w:val="20"/>
+          <w:szCs w:val="20"/>
+          <w:lang w:eastAsia="es-US"/>
+        </w:rPr>
+        <w:t xml:space="preserve">: Compartir con el correo de la </w:t>
+      </w:r>
+      <w:proofErr w:type="spellStart"/>
+      <w:r>
+        <w:rPr>
+          <w:rFonts w:ascii="Segoe UI" w:eastAsia="Times New Roman" w:hAnsi="Segoe UI" w:cs="Segoe UI"/>
+          <w:color w:val="3B3B3B"/>
+          <w:sz w:val="20"/>
+          <w:szCs w:val="20"/>
+          <w:lang w:eastAsia="es-US"/>
+        </w:rPr>
+        <w:t>Service</w:t>
+      </w:r>
+      <w:proofErr w:type="spellEnd"/>
+      <w:r>
+        <w:rPr>
+          <w:rFonts w:ascii="Segoe UI" w:eastAsia="Times New Roman" w:hAnsi="Segoe UI" w:cs="Segoe UI"/>
+          <w:color w:val="3B3B3B"/>
+          <w:sz w:val="20"/>
+          <w:szCs w:val="20"/>
+          <w:lang w:eastAsia="es-US"/>
+        </w:rPr>
+        <w:t xml:space="preserve"> </w:t>
+      </w:r>
+      <w:proofErr w:type="spellStart"/>
+      <w:r>
+        <w:rPr>
+          <w:rFonts w:ascii="Segoe UI" w:eastAsia="Times New Roman" w:hAnsi="Segoe UI" w:cs="Segoe UI"/>
+          <w:color w:val="3B3B3B"/>
+          <w:sz w:val="20"/>
+          <w:szCs w:val="20"/>
+          <w:lang w:eastAsia="es-US"/>
+        </w:rPr>
+        <w:t>Account</w:t>
+      </w:r>
+      <w:proofErr w:type="spellEnd"/>
+      <w:r>
+        <w:rPr>
+          <w:rFonts w:ascii="Segoe UI" w:eastAsia="Times New Roman" w:hAnsi="Segoe UI" w:cs="Segoe UI"/>
+          <w:color w:val="3B3B3B"/>
+          <w:sz w:val="20"/>
+          <w:szCs w:val="20"/>
+          <w:lang w:eastAsia="es-US"/>
+        </w:rPr>
+        <w:t xml:space="preserve"> (</w:t>
+      </w:r>
+      <w:r>
+        <w:rPr>
+          <w:rFonts w:ascii="Consolas" w:eastAsia="Times New Roman" w:hAnsi="Consolas" w:cs="Courier New"/>
+          <w:color w:val="3B3B3B"/>
+          <w:sz w:val="18"/>
+          <w:szCs w:val="18"/>
+          <w:bdr w:val="single" w:sz="2" w:space="0" w:color="auto" w:frame="1"/>
+          <w:lang w:eastAsia="es-US"/>
+        </w:rPr>
+        <w:t>trackcm-bot@trackcm-app.iam.gserviceaccount.com</w:t>
+      </w:r>
+      <w:r>
+        <w:rPr>
+          <w:rFonts w:ascii="Segoe UI" w:eastAsia="Times New Roman" w:hAnsi="Segoe UI" w:cs="Segoe UI"/>
+          <w:color w:val="3B3B3B"/>
+          <w:sz w:val="20"/>
+          <w:szCs w:val="20"/>
+          <w:lang w:eastAsia="es-US"/>
+        </w:rPr>
+        <w:t>) dando permisos de </w:t>
+      </w:r>
+      <w:r>
+        <w:rPr>
+          <w:rFonts w:ascii="Segoe UI" w:eastAsia="Times New Roman" w:hAnsi="Segoe UI" w:cs="Segoe UI"/>
+          <w:b/>
+          <w:bCs/>
+          <w:color w:val="3B3B3B"/>
+          <w:sz w:val="20"/>
+          <w:szCs w:val="20"/>
+          <w:bdr w:val="single" w:sz="2" w:space="0" w:color="auto" w:frame="1"/>
+          <w:lang w:eastAsia="es-US"/>
+        </w:rPr>
+        <w:t>Editor</w:t>
+      </w:r>
+      <w:r>
+        <w:rPr>
+          <w:rFonts w:ascii="Segoe UI" w:eastAsia="Times New Roman" w:hAnsi="Segoe UI" w:cs="Segoe UI"/>
+          <w:color w:val="3B3B3B"/>
+          <w:sz w:val="20"/>
+          <w:szCs w:val="20"/>
+          <w:lang w:eastAsia="es-US"/>
+        </w:rPr>
+        <w:t>.</w:t>
+      </w:r>
+    </w:p>
+    <w:p>
+      <w:pPr>
+        <w:numPr>
+          <w:ilvl w:val="0"/>
+          <w:numId w:val="7"/>
+        </w:numPr>
+        <w:pBdr>
+          <w:top w:val="single" w:sz="2" w:space="0" w:color="auto"/>
+          <w:left w:val="single" w:sz="2" w:space="0" w:color="auto"/>
+          <w:bottom w:val="single" w:sz="2" w:space="0" w:color="auto"/>
+          <w:right w:val="single" w:sz="2" w:space="0" w:color="auto"/>
+        </w:pBdr>
+        <w:shd w:val="clear" w:color="auto" w:fill="F8F8F8"/>
+        <w:spacing w:before="100" w:beforeAutospacing="1" w:after="100" w:afterAutospacing="1" w:line="240" w:lineRule="auto"/>
+        <w:rPr>
+          <w:rFonts w:ascii="Segoe UI" w:eastAsia="Times New Roman" w:hAnsi="Segoe UI" w:cs="Segoe UI"/>
+          <w:color w:val="3B3B3B"/>
+          <w:sz w:val="20"/>
+          <w:szCs w:val="20"/>
+          <w:lang w:eastAsia="es-US"/>
+        </w:rPr>
+      </w:pPr>
+      <w:r>
+        <w:rPr>
+          <w:rFonts w:ascii="Segoe UI" w:eastAsia="Times New Roman" w:hAnsi="Segoe UI" w:cs="Segoe UI"/>
+          <w:b/>
+          <w:bCs/>
+          <w:color w:val="3B3B3B"/>
+          <w:sz w:val="20"/>
+          <w:szCs w:val="20"/>
+          <w:bdr w:val="single" w:sz="2" w:space="0" w:color="auto" w:frame="1"/>
+          <w:lang w:eastAsia="es-US"/>
+        </w:rPr>
+        <w:t>Paso 3 (Google Drive)</w:t>
+      </w:r>
+      <w:r>
+        <w:rPr>
+          <w:rFonts w:ascii="Segoe UI" w:eastAsia="Times New Roman" w:hAnsi="Segoe UI" w:cs="Segoe UI"/>
+          <w:color w:val="3B3B3B"/>
+          <w:sz w:val="20"/>
+          <w:szCs w:val="20"/>
+          <w:lang w:eastAsia="es-US"/>
+        </w:rPr>
+        <w:t>: Copiar el ID único del documento desde la URL.</w:t>
+      </w:r>
+    </w:p>
+    <w:p>
+      <w:pPr>
+        <w:numPr>
+          <w:ilvl w:val="0"/>
+          <w:numId w:val="7"/>
+        </w:numPr>
+        <w:pBdr>
+          <w:top w:val="single" w:sz="2" w:space="0" w:color="auto"/>
+          <w:left w:val="single" w:sz="2" w:space="0" w:color="auto"/>
+          <w:bottom w:val="single" w:sz="2" w:space="0" w:color="auto"/>
+          <w:right w:val="single" w:sz="2" w:space="0" w:color="auto"/>
+        </w:pBdr>
+        <w:shd w:val="clear" w:color="auto" w:fill="F8F8F8"/>
+        <w:spacing w:before="100" w:beforeAutospacing="1" w:after="100" w:afterAutospacing="1" w:line="240" w:lineRule="auto"/>
+        <w:rPr>
+          <w:rFonts w:ascii="Segoe UI" w:eastAsia="Times New Roman" w:hAnsi="Segoe UI" w:cs="Segoe UI"/>
+          <w:color w:val="3B3B3B"/>
+          <w:sz w:val="20"/>
+          <w:szCs w:val="20"/>
+          <w:lang w:eastAsia="es-US"/>
+        </w:rPr>
+      </w:pPr>
+      <w:r>
+        <w:rPr>
+          <w:rFonts w:ascii="Segoe UI" w:eastAsia="Times New Roman" w:hAnsi="Segoe UI" w:cs="Segoe UI"/>
+          <w:b/>
+          <w:bCs/>
+          <w:color w:val="3B3B3B"/>
+          <w:sz w:val="20"/>
+          <w:szCs w:val="20"/>
+          <w:bdr w:val="single" w:sz="2" w:space="0" w:color="auto" w:frame="1"/>
+          <w:lang w:eastAsia="es-US"/>
+        </w:rPr>
+        <w:t>Paso 4 (Base de Datos)</w:t>
+      </w:r>
+      <w:r>
+        <w:rPr>
+          <w:rFonts w:ascii="Segoe UI" w:eastAsia="Times New Roman" w:hAnsi="Segoe UI" w:cs="Segoe UI"/>
+          <w:color w:val="3B3B3B"/>
+          <w:sz w:val="20"/>
+          <w:szCs w:val="20"/>
+          <w:lang w:eastAsia="es-US"/>
+        </w:rPr>
+        <w:t>: Cargar los alumnos en </w:t>
+      </w:r>
+      <w:proofErr w:type="spellStart"/>
+      <w:r>
+        <w:rPr>
+          <w:rFonts w:ascii="Consolas" w:eastAsia="Times New Roman" w:hAnsi="Consolas" w:cs="Courier New"/>
+          <w:color w:val="3B3B3B"/>
+          <w:sz w:val="18"/>
+          <w:szCs w:val="18"/>
+          <w:bdr w:val="single" w:sz="2" w:space="0" w:color="auto" w:frame="1"/>
+          <w:lang w:eastAsia="es-US"/>
+        </w:rPr>
+        <w:t>Alumnos_Inscritos</w:t>
+      </w:r>
+      <w:proofErr w:type="spellEnd"/>
+      <w:r>
+        <w:rPr>
+          <w:rFonts w:ascii="Segoe UI" w:eastAsia="Times New Roman" w:hAnsi="Segoe UI" w:cs="Segoe UI"/>
+          <w:color w:val="3B3B3B"/>
+          <w:sz w:val="20"/>
+          <w:szCs w:val="20"/>
+          <w:lang w:eastAsia="es-US"/>
+        </w:rPr>
+        <w:t> asegurando indicar el nuevo ciclo en la columna </w:t>
+      </w:r>
+      <w:proofErr w:type="spellStart"/>
+      <w:r>
+        <w:rPr>
+          <w:rFonts w:ascii="Consolas" w:eastAsia="Times New Roman" w:hAnsi="Consolas" w:cs="Courier New"/>
+          <w:color w:val="3B3B3B"/>
+          <w:sz w:val="18"/>
+          <w:szCs w:val="18"/>
+          <w:bdr w:val="single" w:sz="2" w:space="0" w:color="auto" w:frame="1"/>
+          <w:lang w:eastAsia="es-US"/>
+        </w:rPr>
+        <w:t>Ciclo_Escolar</w:t>
+      </w:r>
+      <w:proofErr w:type="spellEnd"/>
+      <w:r>
+        <w:rPr>
+          <w:rFonts w:ascii="Segoe UI" w:eastAsia="Times New Roman" w:hAnsi="Segoe UI" w:cs="Segoe UI"/>
+          <w:color w:val="3B3B3B"/>
+          <w:sz w:val="20"/>
+          <w:szCs w:val="20"/>
+          <w:lang w:eastAsia="es-US"/>
+        </w:rPr>
+        <w:t>.</w:t>
+      </w:r>
+    </w:p>
+    <w:p>
+      <w:pPr>
+        <w:numPr>
+          <w:ilvl w:val="0"/>
+          <w:numId w:val="7"/>
+        </w:numPr>
+        <w:pBdr>
+          <w:top w:val="single" w:sz="2" w:space="0" w:color="auto"/>
+          <w:left w:val="single" w:sz="2" w:space="0" w:color="auto"/>
+          <w:bottom w:val="single" w:sz="2" w:space="0" w:color="auto"/>
+          <w:right w:val="single" w:sz="2" w:space="0" w:color="auto"/>
+        </w:pBdr>
+        <w:shd w:val="clear" w:color="auto" w:fill="F8F8F8"/>
+        <w:spacing w:before="100" w:beforeAutospacing="1" w:after="100" w:afterAutospacing="1" w:line="240" w:lineRule="auto"/>
+        <w:rPr>
+          <w:rFonts w:ascii="Segoe UI" w:eastAsia="Times New Roman" w:hAnsi="Segoe UI" w:cs="Segoe UI"/>
+          <w:color w:val="3B3B3B"/>
+          <w:sz w:val="20"/>
+          <w:szCs w:val="20"/>
+          <w:lang w:eastAsia="es-US"/>
+        </w:rPr>
+      </w:pPr>
+      <w:r>
+        <w:rPr>
+          <w:rFonts w:ascii="Segoe UI" w:eastAsia="Times New Roman" w:hAnsi="Segoe UI" w:cs="Segoe UI"/>
+          <w:b/>
+          <w:bCs/>
+          <w:color w:val="3B3B3B"/>
+          <w:sz w:val="20"/>
+          <w:szCs w:val="20"/>
+          <w:bdr w:val="single" w:sz="2" w:space="0" w:color="auto" w:frame="1"/>
+          <w:lang w:eastAsia="es-US"/>
+        </w:rPr>
+        <w:t>Paso 5 (</w:t>
+      </w:r>
+      <w:proofErr w:type="spellStart"/>
+      <w:r>
+        <w:rPr>
+          <w:rFonts w:ascii="Segoe UI" w:eastAsia="Times New Roman" w:hAnsi="Segoe UI" w:cs="Segoe UI"/>
+          <w:b/>
+          <w:bCs/>
+          <w:color w:val="3B3B3B"/>
+          <w:sz w:val="20"/>
+          <w:szCs w:val="20"/>
+          <w:bdr w:val="single" w:sz="2" w:space="0" w:color="auto" w:frame="1"/>
+          <w:lang w:eastAsia="es-US"/>
+        </w:rPr>
+        <w:t>Vercel</w:t>
+      </w:r>
+      <w:proofErr w:type="spellEnd"/>
+      <w:r>
+        <w:rPr>
+          <w:rFonts w:ascii="Segoe UI" w:eastAsia="Times New Roman" w:hAnsi="Segoe UI" w:cs="Segoe UI"/>
+          <w:b/>
+          <w:bCs/>
+          <w:color w:val="3B3B3B"/>
+          <w:sz w:val="20"/>
+          <w:szCs w:val="20"/>
+          <w:bdr w:val="single" w:sz="2" w:space="0" w:color="auto" w:frame="1"/>
+          <w:lang w:eastAsia="es-US"/>
+        </w:rPr>
+        <w:t>)</w:t>
+      </w:r>
+      <w:r>
+        <w:rPr>
+          <w:rFonts w:ascii="Segoe UI" w:eastAsia="Times New Roman" w:hAnsi="Segoe UI" w:cs="Segoe UI"/>
+          <w:color w:val="3B3B3B"/>
+          <w:sz w:val="20"/>
+          <w:szCs w:val="20"/>
+          <w:lang w:eastAsia="es-US"/>
+        </w:rPr>
+        <w:t xml:space="preserve">: Agregar la nueva variable de entorno en </w:t>
+      </w:r>
+      <w:proofErr w:type="spellStart"/>
+      <w:r>
+        <w:rPr>
+          <w:rFonts w:ascii="Segoe UI" w:eastAsia="Times New Roman" w:hAnsi="Segoe UI" w:cs="Segoe UI"/>
+          <w:color w:val="3B3B3B"/>
+          <w:sz w:val="20"/>
+          <w:szCs w:val="20"/>
+          <w:lang w:eastAsia="es-US"/>
+        </w:rPr>
+        <w:t>Vercel</w:t>
+      </w:r>
+      <w:proofErr w:type="spellEnd"/>
+      <w:r>
+        <w:rPr>
+          <w:rFonts w:ascii="Segoe UI" w:eastAsia="Times New Roman" w:hAnsi="Segoe UI" w:cs="Segoe UI"/>
+          <w:color w:val="3B3B3B"/>
+          <w:sz w:val="20"/>
+          <w:szCs w:val="20"/>
+          <w:lang w:eastAsia="es-US"/>
+        </w:rPr>
+        <w:t xml:space="preserve"> (ejemplo: </w:t>
+      </w:r>
+      <w:r>
+        <w:rPr>
+          <w:rFonts w:ascii="Consolas" w:eastAsia="Times New Roman" w:hAnsi="Consolas" w:cs="Courier New"/>
+          <w:color w:val="3B3B3B"/>
+          <w:sz w:val="18"/>
+          <w:szCs w:val="18"/>
+          <w:bdr w:val="single" w:sz="2" w:space="0" w:color="auto" w:frame="1"/>
+          <w:lang w:eastAsia="es-US"/>
+        </w:rPr>
+        <w:t>SPREADSHEET_ID_MEJORES_RESULTADOS_2027_2028</w:t>
+      </w:r>
+      <w:r>
+        <w:rPr>
+          <w:rFonts w:ascii="Segoe UI" w:eastAsia="Times New Roman" w:hAnsi="Segoe UI" w:cs="Segoe UI"/>
+          <w:color w:val="3B3B3B"/>
+          <w:sz w:val="20"/>
+          <w:szCs w:val="20"/>
+          <w:lang w:eastAsia="es-US"/>
+        </w:rPr>
+        <w:t>).</w:t>
+      </w:r>
+    </w:p>
+    <w:p>
+      <w:pPr>
+        <w:numPr>
+          <w:ilvl w:val="0"/>
+          <w:numId w:val="7"/>
+        </w:numPr>
+        <w:pBdr>
+          <w:top w:val="single" w:sz="2" w:space="0" w:color="auto"/>
+          <w:left w:val="single" w:sz="2" w:space="0" w:color="auto"/>
+          <w:bottom w:val="single" w:sz="2" w:space="0" w:color="auto"/>
+          <w:right w:val="single" w:sz="2" w:space="0" w:color="auto"/>
+        </w:pBdr>
+        <w:shd w:val="clear" w:color="auto" w:fill="F8F8F8"/>
+        <w:spacing w:before="100" w:beforeAutospacing="1" w:after="100" w:afterAutospacing="1" w:line="240" w:lineRule="auto"/>
+        <w:rPr>
+          <w:rFonts w:ascii="Segoe UI" w:eastAsia="Times New Roman" w:hAnsi="Segoe UI" w:cs="Segoe UI"/>
+          <w:color w:val="3B3B3B"/>
+          <w:sz w:val="20"/>
+          <w:szCs w:val="20"/>
+          <w:lang w:eastAsia="es-US"/>
+        </w:rPr>
+      </w:pPr>
+      <w:r>
+        <w:rPr>
+          <w:rFonts w:ascii="Segoe UI" w:eastAsia="Times New Roman" w:hAnsi="Segoe UI" w:cs="Segoe UI"/>
+          <w:b/>
+          <w:bCs/>
+          <w:color w:val="3B3B3B"/>
+          <w:sz w:val="20"/>
+          <w:szCs w:val="20"/>
+          <w:bdr w:val="single" w:sz="2" w:space="0" w:color="auto" w:frame="1"/>
+          <w:lang w:eastAsia="es-US"/>
+        </w:rPr>
+        <w:t>Paso 6 (</w:t>
+      </w:r>
+      <w:proofErr w:type="spellStart"/>
+      <w:r>
+        <w:rPr>
+          <w:rFonts w:ascii="Segoe UI" w:eastAsia="Times New Roman" w:hAnsi="Segoe UI" w:cs="Segoe UI"/>
+          <w:b/>
+          <w:bCs/>
+          <w:color w:val="3B3B3B"/>
+          <w:sz w:val="20"/>
+          <w:szCs w:val="20"/>
+          <w:bdr w:val="single" w:sz="2" w:space="0" w:color="auto" w:frame="1"/>
+          <w:lang w:eastAsia="es-US"/>
+        </w:rPr>
+        <w:t>Vercel</w:t>
+      </w:r>
+      <w:proofErr w:type="spellEnd"/>
+      <w:r>
+        <w:rPr>
+          <w:rFonts w:ascii="Segoe UI" w:eastAsia="Times New Roman" w:hAnsi="Segoe UI" w:cs="Segoe UI"/>
+          <w:b/>
+          <w:bCs/>
+          <w:color w:val="3B3B3B"/>
+          <w:sz w:val="20"/>
+          <w:szCs w:val="20"/>
+          <w:bdr w:val="single" w:sz="2" w:space="0" w:color="auto" w:frame="1"/>
+          <w:lang w:eastAsia="es-US"/>
+        </w:rPr>
+        <w:t>)</w:t>
+      </w:r>
+      <w:r>
+        <w:rPr>
+          <w:rFonts w:ascii="Segoe UI" w:eastAsia="Times New Roman" w:hAnsi="Segoe UI" w:cs="Segoe UI"/>
+          <w:color w:val="3B3B3B"/>
+          <w:sz w:val="20"/>
+          <w:szCs w:val="20"/>
+          <w:lang w:eastAsia="es-US"/>
+        </w:rPr>
+        <w:t>: Dar clic en </w:t>
+      </w:r>
+      <w:proofErr w:type="spellStart"/>
+      <w:r>
+        <w:rPr>
+          <w:rFonts w:ascii="Segoe UI" w:eastAsia="Times New Roman" w:hAnsi="Segoe UI" w:cs="Segoe UI"/>
+          <w:b/>
+          <w:bCs/>
+          <w:color w:val="3B3B3B"/>
+          <w:sz w:val="20"/>
+          <w:szCs w:val="20"/>
+          <w:bdr w:val="single" w:sz="2" w:space="0" w:color="auto" w:frame="1"/>
+          <w:lang w:eastAsia="es-US"/>
+        </w:rPr>
+        <w:t>Redeploy</w:t>
+      </w:r>
+      <w:proofErr w:type="spellEnd"/>
+      <w:r>
+        <w:rPr>
+          <w:rFonts w:ascii="Segoe UI" w:eastAsia="Times New Roman" w:hAnsi="Segoe UI" w:cs="Segoe UI"/>
+          <w:color w:val="3B3B3B"/>
+          <w:sz w:val="20"/>
+          <w:szCs w:val="20"/>
+          <w:lang w:eastAsia="es-US"/>
+        </w:rPr>
+        <w:t xml:space="preserve"> en </w:t>
+      </w:r>
+      <w:proofErr w:type="spellStart"/>
+      <w:r>
+        <w:rPr>
+          <w:rFonts w:ascii="Segoe UI" w:eastAsia="Times New Roman" w:hAnsi="Segoe UI" w:cs="Segoe UI"/>
+          <w:color w:val="3B3B3B"/>
+          <w:sz w:val="20"/>
+          <w:szCs w:val="20"/>
+          <w:lang w:eastAsia="es-US"/>
+        </w:rPr>
+        <w:t>Vercel</w:t>
+      </w:r>
+      <w:proofErr w:type="spellEnd"/>
+      <w:r>
+        <w:rPr>
+          <w:rFonts w:ascii="Segoe UI" w:eastAsia="Times New Roman" w:hAnsi="Segoe UI" w:cs="Segoe UI"/>
+          <w:color w:val="3B3B3B"/>
+          <w:sz w:val="20"/>
+          <w:szCs w:val="20"/>
+          <w:lang w:eastAsia="es-US"/>
+        </w:rPr>
+        <w:t xml:space="preserve"> para activar las variables del nuevo año.</w:t>
+      </w:r>
+    </w:p>
+    <w:p>
+      <w:pPr>
+        <w:numPr>
+          <w:ilvl w:val="0"/>
+          <w:numId w:val="7"/>
+        </w:numPr>
+        <w:pBdr>
+          <w:top w:val="single" w:sz="2" w:space="0" w:color="auto"/>
+          <w:left w:val="single" w:sz="2" w:space="0" w:color="auto"/>
+          <w:bottom w:val="single" w:sz="2" w:space="0" w:color="auto"/>
+          <w:right w:val="single" w:sz="2" w:space="0" w:color="auto"/>
+        </w:pBdr>
+        <w:shd w:val="clear" w:color="auto" w:fill="F8F8F8"/>
+        <w:spacing w:before="100" w:beforeAutospacing="1" w:after="100" w:afterAutospacing="1" w:line="240" w:lineRule="auto"/>
+        <w:rPr>
+          <w:rFonts w:ascii="Segoe UI" w:eastAsia="Times New Roman" w:hAnsi="Segoe UI" w:cs="Segoe UI"/>
+          <w:color w:val="3B3B3B"/>
+          <w:sz w:val="20"/>
+          <w:szCs w:val="20"/>
+          <w:lang w:eastAsia="es-US"/>
+        </w:rPr>
+      </w:pPr>
+      <w:r>
+        <w:rPr>
+          <w:rFonts w:ascii="Segoe UI" w:eastAsia="Times New Roman" w:hAnsi="Segoe UI" w:cs="Segoe UI"/>
+          <w:b/>
+          <w:bCs/>
+          <w:color w:val="3B3B3B"/>
+          <w:sz w:val="20"/>
+          <w:szCs w:val="20"/>
+          <w:bdr w:val="single" w:sz="2" w:space="0" w:color="auto" w:frame="1"/>
+          <w:lang w:eastAsia="es-US"/>
+        </w:rPr>
+        <w:t>Paso 7 (Aplicación Web)</w:t>
+      </w:r>
+      <w:r>
+        <w:rPr>
+          <w:rFonts w:ascii="Segoe UI" w:eastAsia="Times New Roman" w:hAnsi="Segoe UI" w:cs="Segoe UI"/>
+          <w:color w:val="3B3B3B"/>
+          <w:sz w:val="20"/>
+          <w:szCs w:val="20"/>
+          <w:lang w:eastAsia="es-US"/>
+        </w:rPr>
+        <w:t>: Seleccionar el nuevo ciclo en el selector de la aplicación.</w:t>
+      </w:r>
+    </w:p>
+    <w:p>
+      <w:pPr>
+        <w:numPr>
+          <w:ilvl w:val="0"/>
+          <w:numId w:val="7"/>
+        </w:numPr>
+        <w:pBdr>
+          <w:top w:val="single" w:sz="2" w:space="0" w:color="auto"/>
+          <w:left w:val="single" w:sz="2" w:space="0" w:color="auto"/>
+          <w:bottom w:val="single" w:sz="2" w:space="0" w:color="auto"/>
+          <w:right w:val="single" w:sz="2" w:space="0" w:color="auto"/>
+        </w:pBdr>
+        <w:shd w:val="clear" w:color="auto" w:fill="F8F8F8"/>
+        <w:spacing w:before="100" w:beforeAutospacing="1" w:after="100" w:afterAutospacing="1" w:line="240" w:lineRule="auto"/>
+        <w:rPr>
+          <w:rFonts w:ascii="Segoe UI" w:eastAsia="Times New Roman" w:hAnsi="Segoe UI" w:cs="Segoe UI"/>
+          <w:color w:val="3B3B3B"/>
+          <w:sz w:val="20"/>
+          <w:szCs w:val="20"/>
+          <w:lang w:eastAsia="es-US"/>
+        </w:rPr>
+      </w:pPr>
+      <w:r>
+        <w:rPr>
+          <w:rFonts w:ascii="Segoe UI" w:eastAsia="Times New Roman" w:hAnsi="Segoe UI" w:cs="Segoe UI"/>
+          <w:b/>
+          <w:bCs/>
+          <w:color w:val="3B3B3B"/>
+          <w:sz w:val="20"/>
+          <w:szCs w:val="20"/>
+          <w:bdr w:val="single" w:sz="2" w:space="0" w:color="auto" w:frame="1"/>
+          <w:lang w:eastAsia="es-US"/>
+        </w:rPr>
+        <w:t>Paso 8 (Aplicación Web)</w:t>
+      </w:r>
+      <w:r>
+        <w:rPr>
+          <w:rFonts w:ascii="Segoe UI" w:eastAsia="Times New Roman" w:hAnsi="Segoe UI" w:cs="Segoe UI"/>
+          <w:color w:val="3B3B3B"/>
+          <w:sz w:val="20"/>
+          <w:szCs w:val="20"/>
+          <w:lang w:eastAsia="es-US"/>
+        </w:rPr>
+        <w:t>: Presionar </w:t>
+      </w:r>
+      <w:r>
+        <w:rPr>
+          <w:rFonts w:ascii="Consolas" w:eastAsia="Times New Roman" w:hAnsi="Consolas" w:cs="Courier New"/>
+          <w:b/>
+          <w:bCs/>
+          <w:color w:val="3B3B3B"/>
+          <w:sz w:val="18"/>
+          <w:szCs w:val="18"/>
+          <w:bdr w:val="single" w:sz="2" w:space="0" w:color="auto" w:frame="1"/>
+          <w:lang w:eastAsia="es-US"/>
+        </w:rPr>
+        <w:t xml:space="preserve">Sincronizar a Google </w:t>
+      </w:r>
+      <w:proofErr w:type="spellStart"/>
+      <w:r>
+        <w:rPr>
+          <w:rFonts w:ascii="Consolas" w:eastAsia="Times New Roman" w:hAnsi="Consolas" w:cs="Courier New"/>
+          <w:b/>
+          <w:bCs/>
+          <w:color w:val="3B3B3B"/>
+          <w:sz w:val="18"/>
+          <w:szCs w:val="18"/>
+          <w:bdr w:val="single" w:sz="2" w:space="0" w:color="auto" w:frame="1"/>
+          <w:lang w:eastAsia="es-US"/>
+        </w:rPr>
+        <w:t>Sheets</w:t>
+      </w:r>
+      <w:proofErr w:type="spellEnd"/>
+      <w:r>
+        <w:rPr>
+          <w:rFonts w:ascii="Segoe UI" w:eastAsia="Times New Roman" w:hAnsi="Segoe UI" w:cs="Segoe UI"/>
+          <w:color w:val="3B3B3B"/>
+          <w:sz w:val="20"/>
+          <w:szCs w:val="20"/>
+          <w:lang w:eastAsia="es-US"/>
+        </w:rPr>
+        <w:t> en la pestaña de Mejores Resultados.</w:t>
+      </w:r>
+    </w:p>
+    <w:p>
+      <w:pPr>
+        <w:pBdr>
+          <w:top w:val="single" w:sz="2" w:space="0" w:color="auto"/>
+          <w:left w:val="single" w:sz="2" w:space="0" w:color="auto"/>
+          <w:bottom w:val="single" w:sz="2" w:space="0" w:color="auto"/>
+          <w:right w:val="single" w:sz="2" w:space="0" w:color="auto"/>
+        </w:pBdr>
+        <w:shd w:val="clear" w:color="auto" w:fill="F8F8F8"/>
+        <w:spacing w:before="100" w:beforeAutospacing="1" w:after="100" w:afterAutospacing="1" w:line="240" w:lineRule="auto"/>
+        <w:outlineLvl w:val="3"/>
+        <w:rPr>
+          <w:rFonts w:ascii="Segoe UI" w:eastAsia="Times New Roman" w:hAnsi="Segoe UI" w:cs="Segoe UI"/>
+          <w:color w:val="3B3B3B"/>
+          <w:sz w:val="20"/>
+          <w:szCs w:val="20"/>
+          <w:lang w:eastAsia="es-US"/>
+        </w:rPr>
+      </w:pPr>
+      <w:r>
+        <w:rPr>
+          <w:rFonts w:ascii="Segoe UI" w:eastAsia="Times New Roman" w:hAnsi="Segoe UI" w:cs="Segoe UI"/>
+          <w:color w:val="3B3B3B"/>
+          <w:sz w:val="20"/>
+          <w:szCs w:val="20"/>
+          <w:lang w:eastAsia="es-US"/>
+        </w:rPr>
+        <w:t>2. Pestaña </w:t>
+      </w:r>
+      <w:r>
+        <w:rPr>
+          <w:rFonts w:ascii="Consolas" w:eastAsia="Times New Roman" w:hAnsi="Consolas" w:cs="Courier New"/>
+          <w:b/>
+          <w:bCs/>
+          <w:color w:val="3B3B3B"/>
+          <w:sz w:val="18"/>
+          <w:szCs w:val="18"/>
+          <w:bdr w:val="single" w:sz="2" w:space="0" w:color="auto" w:frame="1"/>
+          <w:lang w:eastAsia="es-US"/>
+        </w:rPr>
+        <w:t>Variables de Entorno</w:t>
+      </w:r>
+      <w:r>
+        <w:rPr>
+          <w:rFonts w:ascii="Segoe UI" w:eastAsia="Times New Roman" w:hAnsi="Segoe UI" w:cs="Segoe UI"/>
+          <w:color w:val="3B3B3B"/>
+          <w:sz w:val="20"/>
+          <w:szCs w:val="20"/>
+          <w:lang w:eastAsia="es-US"/>
+        </w:rPr>
+        <w:t> (Lista de Referencia):</w:t>
+      </w:r>
+    </w:p>
+    <w:p>
+      <w:pPr>
+        <w:pBdr>
+          <w:top w:val="single" w:sz="2" w:space="0" w:color="auto"/>
+          <w:left w:val="single" w:sz="2" w:space="0" w:color="auto"/>
+          <w:bottom w:val="single" w:sz="2" w:space="0" w:color="auto"/>
+          <w:right w:val="single" w:sz="2" w:space="0" w:color="auto"/>
+        </w:pBdr>
+        <w:shd w:val="clear" w:color="auto" w:fill="F8F8F8"/>
+        <w:spacing w:after="0" w:line="240" w:lineRule="auto"/>
+        <w:rPr>
+          <w:rFonts w:ascii="Segoe UI" w:eastAsia="Times New Roman" w:hAnsi="Segoe UI" w:cs="Segoe UI"/>
+          <w:color w:val="3B3B3B"/>
+          <w:sz w:val="20"/>
+          <w:szCs w:val="20"/>
+          <w:lang w:eastAsia="es-US"/>
+        </w:rPr>
+      </w:pPr>
+      <w:r>
+        <w:rPr>
+          <w:rFonts w:ascii="Segoe UI" w:eastAsia="Times New Roman" w:hAnsi="Segoe UI" w:cs="Segoe UI"/>
+          <w:color w:val="3B3B3B"/>
+          <w:sz w:val="20"/>
+          <w:szCs w:val="20"/>
+          <w:lang w:eastAsia="es-US"/>
+        </w:rPr>
+        <w:t>Una tabla de consulta rápida con los nombres exactos de las variables para los siguientes ciclos escolares:</w:t>
+      </w:r>
+    </w:p>
+    <w:p>
+      <w:pPr>
+        <w:numPr>
+          <w:ilvl w:val="0"/>
+          <w:numId w:val="8"/>
+        </w:numPr>
+        <w:pBdr>
+          <w:top w:val="single" w:sz="2" w:space="0" w:color="auto"/>
+          <w:left w:val="single" w:sz="2" w:space="0" w:color="auto"/>
+          <w:bottom w:val="single" w:sz="2" w:space="0" w:color="auto"/>
+          <w:right w:val="single" w:sz="2" w:space="0" w:color="auto"/>
+        </w:pBdr>
+        <w:shd w:val="clear" w:color="auto" w:fill="F8F8F8"/>
+        <w:spacing w:before="100" w:beforeAutospacing="1" w:after="100" w:afterAutospacing="1" w:line="240" w:lineRule="auto"/>
+        <w:rPr>
+          <w:rFonts w:ascii="Segoe UI" w:eastAsia="Times New Roman" w:hAnsi="Segoe UI" w:cs="Segoe UI"/>
+          <w:color w:val="3B3B3B"/>
+          <w:sz w:val="20"/>
+          <w:szCs w:val="20"/>
+          <w:lang w:eastAsia="es-US"/>
+        </w:rPr>
+      </w:pPr>
+      <w:r>
+        <w:rPr>
+          <w:rFonts w:ascii="Segoe UI" w:eastAsia="Times New Roman" w:hAnsi="Segoe UI" w:cs="Segoe UI"/>
+          <w:b/>
+          <w:bCs/>
+          <w:color w:val="3B3B3B"/>
+          <w:sz w:val="20"/>
+          <w:szCs w:val="20"/>
+          <w:bdr w:val="single" w:sz="2" w:space="0" w:color="auto" w:frame="1"/>
+          <w:lang w:eastAsia="es-US"/>
+        </w:rPr>
+        <w:lastRenderedPageBreak/>
+        <w:t>2026-2027</w:t>
+      </w:r>
+      <w:r>
+        <w:rPr>
+          <w:rFonts w:ascii="Segoe UI" w:eastAsia="Times New Roman" w:hAnsi="Segoe UI" w:cs="Segoe UI"/>
+          <w:color w:val="3B3B3B"/>
+          <w:sz w:val="20"/>
+          <w:szCs w:val="20"/>
+          <w:lang w:eastAsia="es-US"/>
+        </w:rPr>
+        <w:t>: </w:t>
+      </w:r>
+      <w:r>
+        <w:rPr>
+          <w:rFonts w:ascii="Consolas" w:eastAsia="Times New Roman" w:hAnsi="Consolas" w:cs="Courier New"/>
+          <w:color w:val="3B3B3B"/>
+          <w:sz w:val="18"/>
+          <w:szCs w:val="18"/>
+          <w:bdr w:val="single" w:sz="2" w:space="0" w:color="auto" w:frame="1"/>
+          <w:lang w:eastAsia="es-US"/>
+        </w:rPr>
+        <w:t>SPREADSHEET_ID_MEJORES_RESULTADOS</w:t>
+      </w:r>
+    </w:p>
+    <w:p>
+      <w:pPr>
+        <w:numPr>
+          <w:ilvl w:val="0"/>
+          <w:numId w:val="8"/>
+        </w:numPr>
+        <w:pBdr>
+          <w:top w:val="single" w:sz="2" w:space="0" w:color="auto"/>
+          <w:left w:val="single" w:sz="2" w:space="0" w:color="auto"/>
+          <w:bottom w:val="single" w:sz="2" w:space="0" w:color="auto"/>
+          <w:right w:val="single" w:sz="2" w:space="0" w:color="auto"/>
+        </w:pBdr>
+        <w:shd w:val="clear" w:color="auto" w:fill="F8F8F8"/>
+        <w:spacing w:before="100" w:beforeAutospacing="1" w:after="100" w:afterAutospacing="1" w:line="240" w:lineRule="auto"/>
+        <w:rPr>
+          <w:rFonts w:ascii="Segoe UI" w:eastAsia="Times New Roman" w:hAnsi="Segoe UI" w:cs="Segoe UI"/>
+          <w:color w:val="3B3B3B"/>
+          <w:sz w:val="20"/>
+          <w:szCs w:val="20"/>
+          <w:lang w:eastAsia="es-US"/>
+        </w:rPr>
+      </w:pPr>
+      <w:r>
+        <w:rPr>
+          <w:rFonts w:ascii="Segoe UI" w:eastAsia="Times New Roman" w:hAnsi="Segoe UI" w:cs="Segoe UI"/>
+          <w:b/>
+          <w:bCs/>
+          <w:color w:val="3B3B3B"/>
+          <w:sz w:val="20"/>
+          <w:szCs w:val="20"/>
+          <w:bdr w:val="single" w:sz="2" w:space="0" w:color="auto" w:frame="1"/>
+          <w:lang w:eastAsia="es-US"/>
+        </w:rPr>
+        <w:t>2027-2028</w:t>
+      </w:r>
+      <w:r>
+        <w:rPr>
+          <w:rFonts w:ascii="Segoe UI" w:eastAsia="Times New Roman" w:hAnsi="Segoe UI" w:cs="Segoe UI"/>
+          <w:color w:val="3B3B3B"/>
+          <w:sz w:val="20"/>
+          <w:szCs w:val="20"/>
+          <w:lang w:eastAsia="es-US"/>
+        </w:rPr>
+        <w:t>: </w:t>
+      </w:r>
+      <w:r>
+        <w:rPr>
+          <w:rFonts w:ascii="Consolas" w:eastAsia="Times New Roman" w:hAnsi="Consolas" w:cs="Courier New"/>
+          <w:color w:val="3B3B3B"/>
+          <w:sz w:val="18"/>
+          <w:szCs w:val="18"/>
+          <w:bdr w:val="single" w:sz="2" w:space="0" w:color="auto" w:frame="1"/>
+          <w:lang w:eastAsia="es-US"/>
+        </w:rPr>
+        <w:t>SPREADSHEET_ID_MEJORES_RESULTADOS_2027_2028</w:t>
+      </w:r>
+    </w:p>
+    <w:p>
+      <w:pPr>
+        <w:numPr>
+          <w:ilvl w:val="0"/>
+          <w:numId w:val="8"/>
+        </w:numPr>
+        <w:pBdr>
+          <w:top w:val="single" w:sz="2" w:space="0" w:color="auto"/>
+          <w:left w:val="single" w:sz="2" w:space="0" w:color="auto"/>
+          <w:bottom w:val="single" w:sz="2" w:space="0" w:color="auto"/>
+          <w:right w:val="single" w:sz="2" w:space="0" w:color="auto"/>
+        </w:pBdr>
+        <w:shd w:val="clear" w:color="auto" w:fill="F8F8F8"/>
+        <w:spacing w:before="100" w:beforeAutospacing="1" w:after="100" w:afterAutospacing="1" w:line="240" w:lineRule="auto"/>
+        <w:rPr>
+          <w:rFonts w:ascii="Segoe UI" w:eastAsia="Times New Roman" w:hAnsi="Segoe UI" w:cs="Segoe UI"/>
+          <w:color w:val="3B3B3B"/>
+          <w:sz w:val="20"/>
+          <w:szCs w:val="20"/>
+          <w:lang w:eastAsia="es-US"/>
+        </w:rPr>
+      </w:pPr>
+      <w:r>
+        <w:rPr>
+          <w:rFonts w:ascii="Segoe UI" w:eastAsia="Times New Roman" w:hAnsi="Segoe UI" w:cs="Segoe UI"/>
+          <w:b/>
+          <w:bCs/>
+          <w:color w:val="3B3B3B"/>
+          <w:sz w:val="20"/>
+          <w:szCs w:val="20"/>
+          <w:bdr w:val="single" w:sz="2" w:space="0" w:color="auto" w:frame="1"/>
+          <w:lang w:eastAsia="es-US"/>
+        </w:rPr>
+        <w:t>2028-2029</w:t>
+      </w:r>
+      <w:r>
+        <w:rPr>
+          <w:rFonts w:ascii="Segoe UI" w:eastAsia="Times New Roman" w:hAnsi="Segoe UI" w:cs="Segoe UI"/>
+          <w:color w:val="3B3B3B"/>
+          <w:sz w:val="20"/>
+          <w:szCs w:val="20"/>
+          <w:lang w:eastAsia="es-US"/>
+        </w:rPr>
+        <w:t>: </w:t>
+      </w:r>
+      <w:r>
+        <w:rPr>
+          <w:rFonts w:ascii="Consolas" w:eastAsia="Times New Roman" w:hAnsi="Consolas" w:cs="Courier New"/>
+          <w:color w:val="3B3B3B"/>
+          <w:sz w:val="18"/>
+          <w:szCs w:val="18"/>
+          <w:bdr w:val="single" w:sz="2" w:space="0" w:color="auto" w:frame="1"/>
+          <w:lang w:eastAsia="es-US"/>
+        </w:rPr>
+        <w:t>SPREADSHEET_ID_MEJORES_RESULTADOS_2028_2029</w:t>
+      </w:r>
+    </w:p>
+    <w:p>
+      <w:pPr>
+        <w:numPr>
+          <w:ilvl w:val="0"/>
+          <w:numId w:val="8"/>
+        </w:numPr>
+        <w:pBdr>
+          <w:top w:val="single" w:sz="2" w:space="0" w:color="auto"/>
+          <w:left w:val="single" w:sz="2" w:space="0" w:color="auto"/>
+          <w:bottom w:val="single" w:sz="2" w:space="0" w:color="auto"/>
+          <w:right w:val="single" w:sz="2" w:space="0" w:color="auto"/>
+        </w:pBdr>
+        <w:shd w:val="clear" w:color="auto" w:fill="F8F8F8"/>
+        <w:spacing w:before="100" w:beforeAutospacing="1" w:after="100" w:afterAutospacing="1" w:line="240" w:lineRule="auto"/>
+        <w:rPr>
+          <w:rFonts w:ascii="Segoe UI" w:eastAsia="Times New Roman" w:hAnsi="Segoe UI" w:cs="Segoe UI"/>
+          <w:color w:val="3B3B3B"/>
+          <w:sz w:val="20"/>
+          <w:szCs w:val="20"/>
+          <w:lang w:eastAsia="es-US"/>
+        </w:rPr>
+      </w:pPr>
+      <w:r>
+        <w:rPr>
+          <w:rFonts w:ascii="Segoe UI" w:eastAsia="Times New Roman" w:hAnsi="Segoe UI" w:cs="Segoe UI"/>
+          <w:b/>
+          <w:bCs/>
+          <w:color w:val="3B3B3B"/>
+          <w:sz w:val="20"/>
+          <w:szCs w:val="20"/>
+          <w:bdr w:val="single" w:sz="2" w:space="0" w:color="auto" w:frame="1"/>
+          <w:lang w:eastAsia="es-US"/>
+        </w:rPr>
+        <w:t>2029-2030</w:t>
+      </w:r>
+      <w:r>
+        <w:rPr>
+          <w:rFonts w:ascii="Segoe UI" w:eastAsia="Times New Roman" w:hAnsi="Segoe UI" w:cs="Segoe UI"/>
+          <w:color w:val="3B3B3B"/>
+          <w:sz w:val="20"/>
+          <w:szCs w:val="20"/>
+          <w:lang w:eastAsia="es-US"/>
+        </w:rPr>
+        <w:t>: </w:t>
+      </w:r>
+      <w:r>
+        <w:rPr>
+          <w:rFonts w:ascii="Consolas" w:eastAsia="Times New Roman" w:hAnsi="Consolas" w:cs="Courier New"/>
+          <w:color w:val="3B3B3B"/>
+          <w:sz w:val="18"/>
+          <w:szCs w:val="18"/>
+          <w:bdr w:val="single" w:sz="2" w:space="0" w:color="auto" w:frame="1"/>
+          <w:lang w:eastAsia="es-US"/>
+        </w:rPr>
+        <w:t>SPREADSHEET_ID_MEJORES_RESULTADOS_2029_2030</w:t>
+      </w:r>
+    </w:p>
+    <w:p>
+      <w:bookmarkStart w:id="0" w:name="_GoBack"/>
+      <w:bookmarkEnd w:id="0"/>
     </w:p>
     <w:sectPr>
       <w:pgSz w:w="12240" w:h="15840"/>
@@ -220,6 +1787,304 @@
 <file path=word/numbering.xml><?xml version="1.0" encoding="utf-8"?>
 <w:numbering xmlns:wpc="http://schemas.microsoft.com/office/word/2010/wordprocessingCanvas" xmlns:cx="http://schemas.microsoft.com/office/drawing/2014/chartex" xmlns:cx1="http://schemas.microsoft.com/office/drawing/2015/9/8/chartex" xmlns:cx2="http://schemas.microsoft.com/office/drawing/2015/10/21/chartex" xmlns:cx3="http://schemas.microsoft.com/office/drawing/2016/5/9/chartex" xmlns:cx4="http://schemas.microsoft.com/office/drawing/2016/5/10/chartex" xmlns:cx5="http://schemas.microsoft.com/office/drawing/2016/5/11/chartex" xmlns:cx6="http://schemas.microsoft.com/office/drawing/2016/5/12/chartex" xmlns:cx7="http://schemas.microsoft.com/office/drawing/2016/5/13/chartex" xmlns:cx8="http://schemas.microsoft.com/office/drawing/2016/5/14/chartex" xmlns:mc="http://schemas.openxmlformats.org/markup-compatibility/2006" xmlns:aink="http://schemas.microsoft.com/office/drawing/2016/ink" xmlns:am3d="http://schemas.microsoft.com/office/drawing/2017/model3d" xmlns:o="urn:schemas-microsoft-com:office:office" xmlns:r="http://schemas.openxmlformats.org/officeDocument/2006/relationships" xmlns:m="http://schemas.openxmlformats.org/officeDocument/2006/math" xmlns:v="urn:schemas-microsoft-com:vml" xmlns:wp14="http://schemas.microsoft.com/office/word/2010/wordprocessingDrawing" xmlns:wp="http://schemas.openxmlformats.org/drawingml/2006/wordprocessingDrawing" xmlns:w10="urn:schemas-microsoft-com:office:word" xmlns:w="http://schemas.openxmlformats.org/wordprocessingml/2006/main" xmlns:w14="http://schemas.microsoft.com/office/word/2010/wordml" xmlns:w15="http://schemas.microsoft.com/office/word/2012/wordml" xmlns:w16cid="http://schemas.microsoft.com/office/word/2016/wordml/cid" xmlns:w16se="http://schemas.microsoft.com/office/word/2015/wordml/symex" xmlns:wpg="http://schemas.microsoft.com/office/word/2010/wordprocessingGroup" xmlns:wpi="http://schemas.microsoft.com/office/word/2010/wordprocessingInk" xmlns:wne="http://schemas.microsoft.com/office/word/2006/wordml" xmlns:wps="http://schemas.microsoft.com/office/word/2010/wordprocessingShape" mc:Ignorable="w14 w15 w16se w16cid wp14">
   <w:abstractNum w:abstractNumId="0" w15:restartNumberingAfterBreak="0">
+    <w:nsid w:val="0DF40C8D"/>
+    <w:multiLevelType w:val="multilevel"/>
+    <w:tmpl w:val="4322B9AA"/>
+    <w:lvl w:ilvl="0">
+      <w:start w:val="1"/>
+      <w:numFmt w:val="bullet"/>
+      <w:lvlText w:val=""/>
+      <w:lvlJc w:val="left"/>
+      <w:pPr>
+        <w:tabs>
+          <w:tab w:val="num" w:pos="720"/>
+        </w:tabs>
+        <w:ind w:left="720" w:hanging="360"/>
+      </w:pPr>
+      <w:rPr>
+        <w:rFonts w:ascii="Symbol" w:hAnsi="Symbol" w:hint="default"/>
+        <w:sz w:val="20"/>
+      </w:rPr>
+    </w:lvl>
+    <w:lvl w:ilvl="1" w:tentative="1">
+      <w:start w:val="1"/>
+      <w:numFmt w:val="bullet"/>
+      <w:lvlText w:val=""/>
+      <w:lvlJc w:val="left"/>
+      <w:pPr>
+        <w:tabs>
+          <w:tab w:val="num" w:pos="1440"/>
+        </w:tabs>
+        <w:ind w:left="1440" w:hanging="360"/>
+      </w:pPr>
+      <w:rPr>
+        <w:rFonts w:ascii="Symbol" w:hAnsi="Symbol" w:hint="default"/>
+        <w:sz w:val="20"/>
+      </w:rPr>
+    </w:lvl>
+    <w:lvl w:ilvl="2" w:tentative="1">
+      <w:start w:val="1"/>
+      <w:numFmt w:val="bullet"/>
+      <w:lvlText w:val=""/>
+      <w:lvlJc w:val="left"/>
+      <w:pPr>
+        <w:tabs>
+          <w:tab w:val="num" w:pos="2160"/>
+        </w:tabs>
+        <w:ind w:left="2160" w:hanging="360"/>
+      </w:pPr>
+      <w:rPr>
+        <w:rFonts w:ascii="Symbol" w:hAnsi="Symbol" w:hint="default"/>
+        <w:sz w:val="20"/>
+      </w:rPr>
+    </w:lvl>
+    <w:lvl w:ilvl="3" w:tentative="1">
+      <w:start w:val="1"/>
+      <w:numFmt w:val="bullet"/>
+      <w:lvlText w:val=""/>
+      <w:lvlJc w:val="left"/>
+      <w:pPr>
+        <w:tabs>
+          <w:tab w:val="num" w:pos="2880"/>
+        </w:tabs>
+        <w:ind w:left="2880" w:hanging="360"/>
+      </w:pPr>
+      <w:rPr>
+        <w:rFonts w:ascii="Symbol" w:hAnsi="Symbol" w:hint="default"/>
+        <w:sz w:val="20"/>
+      </w:rPr>
+    </w:lvl>
+    <w:lvl w:ilvl="4" w:tentative="1">
+      <w:start w:val="1"/>
+      <w:numFmt w:val="bullet"/>
+      <w:lvlText w:val=""/>
+      <w:lvlJc w:val="left"/>
+      <w:pPr>
+        <w:tabs>
+          <w:tab w:val="num" w:pos="3600"/>
+        </w:tabs>
+        <w:ind w:left="3600" w:hanging="360"/>
+      </w:pPr>
+      <w:rPr>
+        <w:rFonts w:ascii="Symbol" w:hAnsi="Symbol" w:hint="default"/>
+        <w:sz w:val="20"/>
+      </w:rPr>
+    </w:lvl>
+    <w:lvl w:ilvl="5" w:tentative="1">
+      <w:start w:val="1"/>
+      <w:numFmt w:val="bullet"/>
+      <w:lvlText w:val=""/>
+      <w:lvlJc w:val="left"/>
+      <w:pPr>
+        <w:tabs>
+          <w:tab w:val="num" w:pos="4320"/>
+        </w:tabs>
+        <w:ind w:left="4320" w:hanging="360"/>
+      </w:pPr>
+      <w:rPr>
+        <w:rFonts w:ascii="Symbol" w:hAnsi="Symbol" w:hint="default"/>
+        <w:sz w:val="20"/>
+      </w:rPr>
+    </w:lvl>
+    <w:lvl w:ilvl="6" w:tentative="1">
+      <w:start w:val="1"/>
+      <w:numFmt w:val="bullet"/>
+      <w:lvlText w:val=""/>
+      <w:lvlJc w:val="left"/>
+      <w:pPr>
+        <w:tabs>
+          <w:tab w:val="num" w:pos="5040"/>
+        </w:tabs>
+        <w:ind w:left="5040" w:hanging="360"/>
+      </w:pPr>
+      <w:rPr>
+        <w:rFonts w:ascii="Symbol" w:hAnsi="Symbol" w:hint="default"/>
+        <w:sz w:val="20"/>
+      </w:rPr>
+    </w:lvl>
+    <w:lvl w:ilvl="7" w:tentative="1">
+      <w:start w:val="1"/>
+      <w:numFmt w:val="bullet"/>
+      <w:lvlText w:val=""/>
+      <w:lvlJc w:val="left"/>
+      <w:pPr>
+        <w:tabs>
+          <w:tab w:val="num" w:pos="5760"/>
+        </w:tabs>
+        <w:ind w:left="5760" w:hanging="360"/>
+      </w:pPr>
+      <w:rPr>
+        <w:rFonts w:ascii="Symbol" w:hAnsi="Symbol" w:hint="default"/>
+        <w:sz w:val="20"/>
+      </w:rPr>
+    </w:lvl>
+    <w:lvl w:ilvl="8" w:tentative="1">
+      <w:start w:val="1"/>
+      <w:numFmt w:val="bullet"/>
+      <w:lvlText w:val=""/>
+      <w:lvlJc w:val="left"/>
+      <w:pPr>
+        <w:tabs>
+          <w:tab w:val="num" w:pos="6480"/>
+        </w:tabs>
+        <w:ind w:left="6480" w:hanging="360"/>
+      </w:pPr>
+      <w:rPr>
+        <w:rFonts w:ascii="Symbol" w:hAnsi="Symbol" w:hint="default"/>
+        <w:sz w:val="20"/>
+      </w:rPr>
+    </w:lvl>
+  </w:abstractNum>
+  <w:abstractNum w:abstractNumId="1" w15:restartNumberingAfterBreak="0">
+    <w:nsid w:val="14A95B63"/>
+    <w:multiLevelType w:val="multilevel"/>
+    <w:tmpl w:val="76CE5F08"/>
+    <w:lvl w:ilvl="0">
+      <w:start w:val="1"/>
+      <w:numFmt w:val="bullet"/>
+      <w:lvlText w:val=""/>
+      <w:lvlJc w:val="left"/>
+      <w:pPr>
+        <w:tabs>
+          <w:tab w:val="num" w:pos="720"/>
+        </w:tabs>
+        <w:ind w:left="720" w:hanging="360"/>
+      </w:pPr>
+      <w:rPr>
+        <w:rFonts w:ascii="Symbol" w:hAnsi="Symbol" w:hint="default"/>
+        <w:sz w:val="20"/>
+      </w:rPr>
+    </w:lvl>
+    <w:lvl w:ilvl="1" w:tentative="1">
+      <w:start w:val="1"/>
+      <w:numFmt w:val="bullet"/>
+      <w:lvlText w:val=""/>
+      <w:lvlJc w:val="left"/>
+      <w:pPr>
+        <w:tabs>
+          <w:tab w:val="num" w:pos="1440"/>
+        </w:tabs>
+        <w:ind w:left="1440" w:hanging="360"/>
+      </w:pPr>
+      <w:rPr>
+        <w:rFonts w:ascii="Symbol" w:hAnsi="Symbol" w:hint="default"/>
+        <w:sz w:val="20"/>
+      </w:rPr>
+    </w:lvl>
+    <w:lvl w:ilvl="2" w:tentative="1">
+      <w:start w:val="1"/>
+      <w:numFmt w:val="bullet"/>
+      <w:lvlText w:val=""/>
+      <w:lvlJc w:val="left"/>
+      <w:pPr>
+        <w:tabs>
+          <w:tab w:val="num" w:pos="2160"/>
+        </w:tabs>
+        <w:ind w:left="2160" w:hanging="360"/>
+      </w:pPr>
+      <w:rPr>
+        <w:rFonts w:ascii="Symbol" w:hAnsi="Symbol" w:hint="default"/>
+        <w:sz w:val="20"/>
+      </w:rPr>
+    </w:lvl>
+    <w:lvl w:ilvl="3" w:tentative="1">
+      <w:start w:val="1"/>
+      <w:numFmt w:val="bullet"/>
+      <w:lvlText w:val=""/>
+      <w:lvlJc w:val="left"/>
+      <w:pPr>
+        <w:tabs>
+          <w:tab w:val="num" w:pos="2880"/>
+        </w:tabs>
+        <w:ind w:left="2880" w:hanging="360"/>
+      </w:pPr>
+      <w:rPr>
+        <w:rFonts w:ascii="Symbol" w:hAnsi="Symbol" w:hint="default"/>
+        <w:sz w:val="20"/>
+      </w:rPr>
+    </w:lvl>
+    <w:lvl w:ilvl="4" w:tentative="1">
+      <w:start w:val="1"/>
+      <w:numFmt w:val="bullet"/>
+      <w:lvlText w:val=""/>
+      <w:lvlJc w:val="left"/>
+      <w:pPr>
+        <w:tabs>
+          <w:tab w:val="num" w:pos="3600"/>
+        </w:tabs>
+        <w:ind w:left="3600" w:hanging="360"/>
+      </w:pPr>
+      <w:rPr>
+        <w:rFonts w:ascii="Symbol" w:hAnsi="Symbol" w:hint="default"/>
+        <w:sz w:val="20"/>
+      </w:rPr>
+    </w:lvl>
+    <w:lvl w:ilvl="5" w:tentative="1">
+      <w:start w:val="1"/>
+      <w:numFmt w:val="bullet"/>
+      <w:lvlText w:val=""/>
+      <w:lvlJc w:val="left"/>
+      <w:pPr>
+        <w:tabs>
+          <w:tab w:val="num" w:pos="4320"/>
+        </w:tabs>
+        <w:ind w:left="4320" w:hanging="360"/>
+      </w:pPr>
+      <w:rPr>
+        <w:rFonts w:ascii="Symbol" w:hAnsi="Symbol" w:hint="default"/>
+        <w:sz w:val="20"/>
+      </w:rPr>
+    </w:lvl>
+    <w:lvl w:ilvl="6" w:tentative="1">
+      <w:start w:val="1"/>
+      <w:numFmt w:val="bullet"/>
+      <w:lvlText w:val=""/>
+      <w:lvlJc w:val="left"/>
+      <w:pPr>
+        <w:tabs>
+          <w:tab w:val="num" w:pos="5040"/>
+        </w:tabs>
+        <w:ind w:left="5040" w:hanging="360"/>
+      </w:pPr>
+      <w:rPr>
+        <w:rFonts w:ascii="Symbol" w:hAnsi="Symbol" w:hint="default"/>
+        <w:sz w:val="20"/>
+      </w:rPr>
+    </w:lvl>
+    <w:lvl w:ilvl="7" w:tentative="1">
+      <w:start w:val="1"/>
+      <w:numFmt w:val="bullet"/>
+      <w:lvlText w:val=""/>
+      <w:lvlJc w:val="left"/>
+      <w:pPr>
+        <w:tabs>
+          <w:tab w:val="num" w:pos="5760"/>
+        </w:tabs>
+        <w:ind w:left="5760" w:hanging="360"/>
+      </w:pPr>
+      <w:rPr>
+        <w:rFonts w:ascii="Symbol" w:hAnsi="Symbol" w:hint="default"/>
+        <w:sz w:val="20"/>
+      </w:rPr>
+    </w:lvl>
+    <w:lvl w:ilvl="8" w:tentative="1">
+      <w:start w:val="1"/>
+      <w:numFmt w:val="bullet"/>
+      <w:lvlText w:val=""/>
+      <w:lvlJc w:val="left"/>
+      <w:pPr>
+        <w:tabs>
+          <w:tab w:val="num" w:pos="6480"/>
+        </w:tabs>
+        <w:ind w:left="6480" w:hanging="360"/>
+      </w:pPr>
+      <w:rPr>
+        <w:rFonts w:ascii="Symbol" w:hAnsi="Symbol" w:hint="default"/>
+        <w:sz w:val="20"/>
+      </w:rPr>
+    </w:lvl>
+  </w:abstractNum>
+  <w:abstractNum w:abstractNumId="2" w15:restartNumberingAfterBreak="0">
     <w:nsid w:val="25561EF1"/>
     <w:multiLevelType w:val="multilevel"/>
     <w:tmpl w:val="6C4874DE"/>
@@ -332,7 +2197,7 @@
       </w:pPr>
     </w:lvl>
   </w:abstractNum>
-  <w:abstractNum w:abstractNumId="1" w15:restartNumberingAfterBreak="0">
+  <w:abstractNum w:abstractNumId="3" w15:restartNumberingAfterBreak="0">
     <w:nsid w:val="3DCD2C3C"/>
     <w:multiLevelType w:val="multilevel"/>
     <w:tmpl w:val="5400E876"/>
@@ -481,7 +2346,7 @@
       </w:rPr>
     </w:lvl>
   </w:abstractNum>
-  <w:abstractNum w:abstractNumId="2" w15:restartNumberingAfterBreak="0">
+  <w:abstractNum w:abstractNumId="4" w15:restartNumberingAfterBreak="0">
     <w:nsid w:val="43C11876"/>
     <w:multiLevelType w:val="multilevel"/>
     <w:tmpl w:val="54D6F500"/>
@@ -594,7 +2459,7 @@
       </w:pPr>
     </w:lvl>
   </w:abstractNum>
-  <w:abstractNum w:abstractNumId="3" w15:restartNumberingAfterBreak="0">
+  <w:abstractNum w:abstractNumId="5" w15:restartNumberingAfterBreak="0">
     <w:nsid w:val="5C78384C"/>
     <w:multiLevelType w:val="multilevel"/>
     <w:tmpl w:val="E772BD80"/>
@@ -743,7 +2608,7 @@
       </w:rPr>
     </w:lvl>
   </w:abstractNum>
-  <w:abstractNum w:abstractNumId="4" w15:restartNumberingAfterBreak="0">
+  <w:abstractNum w:abstractNumId="6" w15:restartNumberingAfterBreak="0">
     <w:nsid w:val="623B2C39"/>
     <w:multiLevelType w:val="multilevel"/>
     <w:tmpl w:val="6E205CC8"/>
@@ -892,20 +2757,142 @@
       </w:rPr>
     </w:lvl>
   </w:abstractNum>
+  <w:abstractNum w:abstractNumId="7" w15:restartNumberingAfterBreak="0">
+    <w:nsid w:val="7A060B25"/>
+    <w:multiLevelType w:val="multilevel"/>
+    <w:tmpl w:val="630AD436"/>
+    <w:lvl w:ilvl="0">
+      <w:start w:val="1"/>
+      <w:numFmt w:val="decimal"/>
+      <w:lvlText w:val="%1."/>
+      <w:lvlJc w:val="left"/>
+      <w:pPr>
+        <w:tabs>
+          <w:tab w:val="num" w:pos="720"/>
+        </w:tabs>
+        <w:ind w:left="720" w:hanging="360"/>
+      </w:pPr>
+    </w:lvl>
+    <w:lvl w:ilvl="1" w:tentative="1">
+      <w:start w:val="1"/>
+      <w:numFmt w:val="decimal"/>
+      <w:lvlText w:val="%2."/>
+      <w:lvlJc w:val="left"/>
+      <w:pPr>
+        <w:tabs>
+          <w:tab w:val="num" w:pos="1440"/>
+        </w:tabs>
+        <w:ind w:left="1440" w:hanging="360"/>
+      </w:pPr>
+    </w:lvl>
+    <w:lvl w:ilvl="2" w:tentative="1">
+      <w:start w:val="1"/>
+      <w:numFmt w:val="decimal"/>
+      <w:lvlText w:val="%3."/>
+      <w:lvlJc w:val="left"/>
+      <w:pPr>
+        <w:tabs>
+          <w:tab w:val="num" w:pos="2160"/>
+        </w:tabs>
+        <w:ind w:left="2160" w:hanging="360"/>
+      </w:pPr>
+    </w:lvl>
+    <w:lvl w:ilvl="3" w:tentative="1">
+      <w:start w:val="1"/>
+      <w:numFmt w:val="decimal"/>
+      <w:lvlText w:val="%4."/>
+      <w:lvlJc w:val="left"/>
+      <w:pPr>
+        <w:tabs>
+          <w:tab w:val="num" w:pos="2880"/>
+        </w:tabs>
+        <w:ind w:left="2880" w:hanging="360"/>
+      </w:pPr>
+    </w:lvl>
+    <w:lvl w:ilvl="4" w:tentative="1">
+      <w:start w:val="1"/>
+      <w:numFmt w:val="decimal"/>
+      <w:lvlText w:val="%5."/>
+      <w:lvlJc w:val="left"/>
+      <w:pPr>
+        <w:tabs>
+          <w:tab w:val="num" w:pos="3600"/>
+        </w:tabs>
+        <w:ind w:left="3600" w:hanging="360"/>
+      </w:pPr>
+    </w:lvl>
+    <w:lvl w:ilvl="5" w:tentative="1">
+      <w:start w:val="1"/>
+      <w:numFmt w:val="decimal"/>
+      <w:lvlText w:val="%6."/>
+      <w:lvlJc w:val="left"/>
+      <w:pPr>
+        <w:tabs>
+          <w:tab w:val="num" w:pos="4320"/>
+        </w:tabs>
+        <w:ind w:left="4320" w:hanging="360"/>
+      </w:pPr>
+    </w:lvl>
+    <w:lvl w:ilvl="6" w:tentative="1">
+      <w:start w:val="1"/>
+      <w:numFmt w:val="decimal"/>
+      <w:lvlText w:val="%7."/>
+      <w:lvlJc w:val="left"/>
+      <w:pPr>
+        <w:tabs>
+          <w:tab w:val="num" w:pos="5040"/>
+        </w:tabs>
+        <w:ind w:left="5040" w:hanging="360"/>
+      </w:pPr>
+    </w:lvl>
+    <w:lvl w:ilvl="7" w:tentative="1">
+      <w:start w:val="1"/>
+      <w:numFmt w:val="decimal"/>
+      <w:lvlText w:val="%8."/>
+      <w:lvlJc w:val="left"/>
+      <w:pPr>
+        <w:tabs>
+          <w:tab w:val="num" w:pos="5760"/>
+        </w:tabs>
+        <w:ind w:left="5760" w:hanging="360"/>
+      </w:pPr>
+    </w:lvl>
+    <w:lvl w:ilvl="8" w:tentative="1">
+      <w:start w:val="1"/>
+      <w:numFmt w:val="decimal"/>
+      <w:lvlText w:val="%9."/>
+      <w:lvlJc w:val="left"/>
+      <w:pPr>
+        <w:tabs>
+          <w:tab w:val="num" w:pos="6480"/>
+        </w:tabs>
+        <w:ind w:left="6480" w:hanging="360"/>
+      </w:pPr>
+    </w:lvl>
+  </w:abstractNum>
   <w:num w:numId="1">
+    <w:abstractNumId w:val="3"/>
+  </w:num>
+  <w:num w:numId="2">
+    <w:abstractNumId w:val="4"/>
+  </w:num>
+  <w:num w:numId="3">
+    <w:abstractNumId w:val="5"/>
+  </w:num>
+  <w:num w:numId="4">
+    <w:abstractNumId w:val="2"/>
+  </w:num>
+  <w:num w:numId="5">
+    <w:abstractNumId w:val="6"/>
+  </w:num>
+  <w:num w:numId="6">
+    <w:abstractNumId w:val="7"/>
+  </w:num>
+  <w:num w:numId="7">
     <w:abstractNumId w:val="1"/>
   </w:num>
-  <w:num w:numId="2">
-    <w:abstractNumId w:val="2"/>
-  </w:num>
-  <w:num w:numId="3">
-    <w:abstractNumId w:val="3"/>
-  </w:num>
-  <w:num w:numId="4">
+  <w:num w:numId="8">
     <w:abstractNumId w:val="0"/>
-  </w:num>
-  <w:num w:numId="5">
-    <w:abstractNumId w:val="4"/>
   </w:num>
 </w:numbering>
 </file>
@@ -1457,6 +3444,16 @@
       <w:iCs/>
     </w:rPr>
   </w:style>
+  <w:style w:type="character" w:customStyle="1" w:styleId="context-scope-mention">
+    <w:name w:val="context-scope-mention"/>
+    <w:basedOn w:val="Fuentedeprrafopredeter"/>
+    <w:rsid w:val="002E4AC4"/>
+  </w:style>
+  <w:style w:type="character" w:customStyle="1" w:styleId="inline-flex">
+    <w:name w:val="inline-flex"/>
+    <w:basedOn w:val="Fuentedeprrafopredeter"/>
+    <w:rsid w:val="002E4AC4"/>
+  </w:style>
 </w:styles>
 </file>
 

</xml_diff>